<commit_message>
Finalize Esperia and Galascope LOIs (R13) with two-way pricing.
Add shared loi_docx_common helpers, split generators, per-batch exit,
reimbursement and longstop fixes, and explicit Indicative/Confirmed
adjustments up and down in Section 4.3.
</commit_message>
<xml_diff>
--- a/docs/clients/group-order/Group2_Esperia_Energy/LOI-Esperia-Energy-pipeline-may2026.docx
+++ b/docs/clients/group-order/Group2_Esperia_Energy/LOI-Esperia-Energy-pipeline-may2026.docx
@@ -23,7 +23,6 @@
           <w:p>
             <w:pPr>
               <w:spacing w:before="120" w:after="120"/>
-              <w:jc w:val="left"/>
             </w:pPr>
             <w:r>
               <w:rPr>
@@ -77,7 +76,7 @@
                 <w:color w:val="FFFFFF"/>
                 <w:sz w:val="16"/>
               </w:rPr>
-              <w:t>Ref: LCY-LOI-ESP-PIPELINE-2026-R4</w:t>
+              <w:t>Ref: LCY-LOI-ESP-PIPELINE-2026-R13</w:t>
               <w:br/>
             </w:r>
             <w:r>
@@ -112,10 +111,6 @@
       </w:pPr>
     </w:p>
     <w:p>
-      <w:pPr>
-        <w:spacing w:after="40"/>
-        <w:jc w:val="left"/>
-      </w:pPr>
       <w:r>
         <w:rPr>
           <w:rFonts w:ascii="Calibri" w:hAnsi="Calibri"/>
@@ -128,9 +123,6 @@
       </w:r>
     </w:p>
     <w:p>
-      <w:pPr>
-        <w:spacing w:after="200"/>
-      </w:pPr>
       <w:r>
         <w:rPr>
           <w:rFonts w:ascii="Calibri" w:hAnsi="Calibri"/>
@@ -139,7 +131,7 @@
           <w:color w:val="404040"/>
           <w:sz w:val="22"/>
         </w:rPr>
-        <w:t>Esperia Energy Group — Galascope &amp; BESS Pipeline Commitment</w:t>
+        <w:t>Esperia Energy Group — BESS Pipeline Commitment (Schedule 1)</w:t>
       </w:r>
     </w:p>
     <w:p>
@@ -177,7 +169,6 @@
           </w:tcPr>
           <w:p>
             <w:pPr>
-              <w:spacing w:before="80" w:after="80"/>
               <w:jc w:val="center"/>
             </w:pPr>
             <w:r>
@@ -197,9 +188,6 @@
             <w:tcW w:w="6520" w:type="dxa"/>
           </w:tcPr>
           <w:p>
-            <w:pPr>
-              <w:spacing w:before="80" w:after="80"/>
-            </w:pPr>
             <w:r>
               <w:rPr>
                 <w:rFonts w:ascii="Calibri" w:hAnsi="Calibri"/>
@@ -218,7 +206,7 @@
               <w:br/>
               <w:t>office@lighthief.com | +357 77 77 00 50</w:t>
               <w:br/>
-              <w:t>(hereinafter “Lighthief” or the “Contractor”)</w:t>
+              <w:t>(hereinafter "Lighthief" or the "Contractor")</w:t>
             </w:r>
           </w:p>
         </w:tc>
@@ -232,7 +220,6 @@
           </w:tcPr>
           <w:p>
             <w:pPr>
-              <w:spacing w:before="80" w:after="80"/>
               <w:jc w:val="center"/>
             </w:pPr>
             <w:r>
@@ -252,9 +239,6 @@
             <w:tcW w:w="6520" w:type="dxa"/>
           </w:tcPr>
           <w:p>
-            <w:pPr>
-              <w:spacing w:before="80" w:after="80"/>
-            </w:pPr>
             <w:r>
               <w:rPr>
                 <w:rFonts w:ascii="Calibri" w:hAnsi="Calibri"/>
@@ -265,22 +249,17 @@
               </w:rPr>
               <w:t>Esperia Energy Group</w:t>
               <w:br/>
-              <w:t>represented by: Dino Constantinou (Owner)</w:t>
+              <w:t>Christaki Kranou 18, Limassol 4046, Cyprus</w:t>
               <w:br/>
-              <w:t>Famagusta, Limassol and Nicosia districts, Cyprus</w:t>
+              <w:t>represented by: Ntinos Konstantinos (Owner)</w:t>
               <w:br/>
               <w:br/>
-              <w:t>(hereinafter “the Client”)</w:t>
+              <w:t>(hereinafter "the Client")</w:t>
             </w:r>
           </w:p>
         </w:tc>
       </w:tr>
     </w:tbl>
-    <w:p>
-      <w:pPr>
-        <w:spacing w:after="40"/>
-      </w:pPr>
-    </w:p>
     <w:p>
       <w:pPr>
         <w:spacing w:before="320" w:after="80"/>
@@ -298,7 +277,6 @@
     </w:p>
     <w:p>
       <w:pPr>
-        <w:spacing w:after="80"/>
         <w:jc w:val="both"/>
       </w:pPr>
       <w:r>
@@ -324,7 +302,6 @@
     </w:p>
     <w:p>
       <w:pPr>
-        <w:spacing w:after="80"/>
         <w:jc w:val="both"/>
       </w:pPr>
       <w:r>
@@ -350,7 +327,6 @@
     </w:p>
     <w:p>
       <w:pPr>
-        <w:spacing w:after="80"/>
         <w:jc w:val="both"/>
       </w:pPr>
       <w:r>
@@ -371,13 +347,8 @@
           <w:color w:val="000000"/>
           <w:sz w:val="20"/>
         </w:rPr>
-        <w:t>The Client wishes to commit to the eleven (11) parks in Schedule 1, including Galascope 1 and Galascope 2 (Galascope Ltd) and nine (9) further group parks.</w:t>
+        <w:t>The Client wishes to commit to the nine (9) pipeline parks in Schedule 1 (75.5 MW / 315.0 MWh). Galascope 1 and Galascope 2 are covered under a separate Letter of Intent with Galascope Ltd (Ref: LCY-LOI-GAL-B1-2026).</w:t>
       </w:r>
-    </w:p>
-    <w:p>
-      <w:pPr>
-        <w:spacing w:after="40"/>
-      </w:pPr>
     </w:p>
     <w:p>
       <w:pPr>
@@ -423,7 +394,7 @@
           <w:color w:val="000000"/>
           <w:sz w:val="20"/>
         </w:rPr>
-        <w:t>1.1  The Client confirms its intention to award BESS EPC contracts to Lighthief for eleven (11) parks in Schedule 1: Galascope 1 (5.0 MW / 20 MWh) and Galascope 2 (2.5 MW / 10 MWh) with Galascope Ltd under EPC ref. LCY-EPC-GAL-B1-2026; and nine (9) further Esperia group parks (72.2 MW / 287.5 MWh). Combined indicative value €33,488,228 (excl. VAT), based on Linyang quotation LY202601271 and group-order pricing.</w:t>
+        <w:t>1.1  The Client confirms its intention to award BESS EPC contracts to Lighthief for nine (9) parks in Schedule 1 (75.5 MW / 315.0 MWh). Combined indicative value €34,458,823 (excl. VAT), based on Linyang quotation LY202601271 and group-order pricing. This LOI does not include Galascope Ltd parks.</w:t>
       </w:r>
     </w:p>
     <w:p>
@@ -439,7 +410,7 @@
           <w:color w:val="000000"/>
           <w:sz w:val="20"/>
         </w:rPr>
-        <w:t>1.2  This LOI supports Lighthief’s procurement and OEM planning. Except where expressly stated as binding below, this LOI is not an obligation to sign any EPC; each EPC (Galascope batch and each pipeline phase) is binding only when signed.</w:t>
+        <w:t>1.2  This LOI supports Lighthief's procurement and OEM planning. Except where expressly stated as binding below, this LOI is not an obligation to sign any EPC; each phase EPC is binding only when signed.</w:t>
       </w:r>
     </w:p>
     <w:p>
@@ -455,7 +426,23 @@
           <w:color w:val="000000"/>
           <w:sz w:val="20"/>
         </w:rPr>
-        <w:t>1.3  (Binding) If the Client withdraws from Schedule 1 without valid reason after Lighthief has reasonably relied on this LOI, the Client shall reimburse documented pre-contractual costs directly incurred.</w:t>
+        <w:t>1.3  (Binding) If the Client withdraws after Lighthief has relied on this LOI, the Client reimburses third-party costs paid or non-cancellable third-party commitments for Schedule 1 parks (evidenced by invoice or signed contract), unless withdrawal is for a Valid Reason. Total reimbursement under this Clause is capped at €400,000.</w:t>
+      </w:r>
+    </w:p>
+    <w:p>
+      <w:pPr>
+        <w:spacing w:after="100"/>
+        <w:jc w:val="both"/>
+      </w:pPr>
+      <w:r>
+        <w:rPr>
+          <w:rFonts w:ascii="Calibri" w:hAnsi="Calibri"/>
+          <w:b w:val="0"/>
+          <w:i w:val="0"/>
+          <w:color w:val="000000"/>
+          <w:sz w:val="20"/>
+        </w:rPr>
+        <w:t>Valid Reason: (a) grid Connection Terms / licence not obtained within twelve (12) months of the EPC Effective Date (or such other longstop as the EPC specifies); (b) change in law or DSO/EAC rules makes installation unlawful or impossible (adviser certificate); (c) mutual written termination; (d) Lighthief material breach not remedied within thirty (30) days; (e) project financing for a park is not secured despite reasonable efforts evidenced in writing; (f) Linyang insolvency or sanctions preventing supply. New third-party spend above €50,000 per park requires the Client's prior written approval.</w:t>
       </w:r>
     </w:p>
     <w:p>
@@ -473,25 +460,8 @@
         <w:t>2.   SCHEDULE 1 — PARKS AND INDICATIVE PRICING</w:t>
       </w:r>
     </w:p>
-    <w:p>
-      <w:pPr>
-        <w:spacing w:after="100"/>
-        <w:jc w:val="both"/>
-      </w:pPr>
-      <w:r>
-        <w:rPr>
-          <w:rFonts w:ascii="Calibri" w:hAnsi="Calibri"/>
-          <w:b w:val="0"/>
-          <w:i w:val="0"/>
-          <w:color w:val="000000"/>
-          <w:sz w:val="20"/>
-        </w:rPr>
-        <w:t>Indicative prices only. Final terms are set in each executed EPC (Lighthief EPC template v5.1 or successor).</w:t>
-      </w:r>
-    </w:p>
     <w:tbl>
       <w:tblPr>
-        <w:jc w:val="left"/>
         <w:tblLook w:firstColumn="1" w:firstRow="1" w:lastColumn="0" w:lastRow="0" w:noHBand="0" w:noVBand="1" w:val="04A0"/>
         <w:tblW w:w="7936" w:type="dxa"/>
         <w:tblLayout w:type="fixed"/>
@@ -506,12 +476,10 @@
         <w:tc>
           <w:tcPr>
             <w:shd w:val="clear" w:color="auto" w:fill="EBF0F7"/>
-            <w:vAlign w:val="center"/>
             <w:tcW w:w="1984" w:type="dxa"/>
           </w:tcPr>
           <w:p>
             <w:pPr>
-              <w:spacing w:before="120" w:after="120"/>
               <w:jc w:val="center"/>
             </w:pPr>
             <w:r>
@@ -522,7 +490,7 @@
                 <w:color w:val="1A365D"/>
                 <w:sz w:val="24"/>
               </w:rPr>
-              <w:t>11 Parks</w:t>
+              <w:t>9 Parks</w:t>
               <w:br/>
             </w:r>
             <w:r>
@@ -540,12 +508,10 @@
         <w:tc>
           <w:tcPr>
             <w:shd w:val="clear" w:color="auto" w:fill="EBF0F7"/>
-            <w:vAlign w:val="center"/>
             <w:tcW w:w="1984" w:type="dxa"/>
           </w:tcPr>
           <w:p>
             <w:pPr>
-              <w:spacing w:before="120" w:after="120"/>
               <w:jc w:val="center"/>
             </w:pPr>
             <w:r>
@@ -556,7 +522,7 @@
                 <w:color w:val="1A365D"/>
                 <w:sz w:val="24"/>
               </w:rPr>
-              <w:t>79.75 MW</w:t>
+              <w:t>75.49 MW</w:t>
               <w:br/>
             </w:r>
             <w:r>
@@ -574,12 +540,10 @@
         <w:tc>
           <w:tcPr>
             <w:shd w:val="clear" w:color="auto" w:fill="EBF0F7"/>
-            <w:vAlign w:val="center"/>
             <w:tcW w:w="1984" w:type="dxa"/>
           </w:tcPr>
           <w:p>
             <w:pPr>
-              <w:spacing w:before="120" w:after="120"/>
               <w:jc w:val="center"/>
             </w:pPr>
             <w:r>
@@ -590,7 +554,7 @@
                 <w:color w:val="1A365D"/>
                 <w:sz w:val="24"/>
               </w:rPr>
-              <w:t>317.5 MWh</w:t>
+              <w:t>315.0 MWh</w:t>
               <w:br/>
             </w:r>
             <w:r>
@@ -608,12 +572,10 @@
         <w:tc>
           <w:tcPr>
             <w:shd w:val="clear" w:color="auto" w:fill="EBF0F7"/>
-            <w:vAlign w:val="center"/>
             <w:tcW w:w="1984" w:type="dxa"/>
           </w:tcPr>
           <w:p>
             <w:pPr>
-              <w:spacing w:before="120" w:after="120"/>
               <w:jc w:val="center"/>
             </w:pPr>
             <w:r>
@@ -624,7 +586,7 @@
                 <w:color w:val="1A365D"/>
                 <w:sz w:val="24"/>
               </w:rPr>
-              <w:t>€33,488,228</w:t>
+              <w:t>€34,458,823</w:t>
               <w:br/>
             </w:r>
             <w:r>
@@ -641,32 +603,28 @@
         </w:tc>
       </w:tr>
     </w:tbl>
-    <w:p>
-      <w:pPr>
-        <w:spacing w:after="80"/>
-      </w:pPr>
-    </w:p>
     <w:tbl>
       <w:tblPr>
         <w:jc w:val="left"/>
         <w:tblLook w:firstColumn="1" w:firstRow="1" w:lastColumn="0" w:lastRow="0" w:noHBand="0" w:noVBand="1" w:val="04A0"/>
-        <w:tblW w:w="7936" w:type="dxa"/>
+        <w:tblW w:w="7369" w:type="dxa"/>
         <w:tblLayout w:type="fixed"/>
       </w:tblPr>
       <w:tblGrid>
-        <w:gridCol w:w="2948"/>
-        <w:gridCol w:w="963"/>
-        <w:gridCol w:w="737"/>
-        <w:gridCol w:w="737"/>
+        <w:gridCol w:w="2154"/>
+        <w:gridCol w:w="793"/>
         <w:gridCol w:w="567"/>
-        <w:gridCol w:w="1984"/>
+        <w:gridCol w:w="567"/>
+        <w:gridCol w:w="1020"/>
+        <w:gridCol w:w="1134"/>
+        <w:gridCol w:w="1134"/>
       </w:tblGrid>
       <w:tr>
         <w:tc>
           <w:tcPr>
             <w:shd w:val="clear" w:color="auto" w:fill="1A365D"/>
             <w:vAlign w:val="center"/>
-            <w:tcW w:w="2948" w:type="dxa"/>
+            <w:tcW w:w="2154" w:type="dxa"/>
           </w:tcPr>
           <w:p>
             <w:pPr>
@@ -688,7 +646,7 @@
           <w:tcPr>
             <w:shd w:val="clear" w:color="auto" w:fill="1A365D"/>
             <w:vAlign w:val="center"/>
-            <w:tcW w:w="963" w:type="dxa"/>
+            <w:tcW w:w="793" w:type="dxa"/>
           </w:tcPr>
           <w:p>
             <w:pPr>
@@ -710,7 +668,7 @@
           <w:tcPr>
             <w:shd w:val="clear" w:color="auto" w:fill="1A365D"/>
             <w:vAlign w:val="center"/>
-            <w:tcW w:w="737" w:type="dxa"/>
+            <w:tcW w:w="567" w:type="dxa"/>
           </w:tcPr>
           <w:p>
             <w:pPr>
@@ -732,7 +690,7 @@
           <w:tcPr>
             <w:shd w:val="clear" w:color="auto" w:fill="1A365D"/>
             <w:vAlign w:val="center"/>
-            <w:tcW w:w="737" w:type="dxa"/>
+            <w:tcW w:w="567" w:type="dxa"/>
           </w:tcPr>
           <w:p>
             <w:pPr>
@@ -754,7 +712,7 @@
           <w:tcPr>
             <w:shd w:val="clear" w:color="auto" w:fill="1A365D"/>
             <w:vAlign w:val="center"/>
-            <w:tcW w:w="567" w:type="dxa"/>
+            <w:tcW w:w="1020" w:type="dxa"/>
           </w:tcPr>
           <w:p>
             <w:pPr>
@@ -768,7 +726,7 @@
                 <w:color w:val="FFFFFF"/>
                 <w:sz w:val="16"/>
               </w:rPr>
-              <w:t>Cont.</w:t>
+              <w:t>Indicative delivery</w:t>
             </w:r>
           </w:p>
         </w:tc>
@@ -776,7 +734,29 @@
           <w:tcPr>
             <w:shd w:val="clear" w:color="auto" w:fill="1A365D"/>
             <w:vAlign w:val="center"/>
-            <w:tcW w:w="1984" w:type="dxa"/>
+            <w:tcW w:w="1134" w:type="dxa"/>
+          </w:tcPr>
+          <w:p>
+            <w:pPr>
+              <w:jc w:val="center"/>
+            </w:pPr>
+            <w:r>
+              <w:rPr>
+                <w:rFonts w:ascii="Calibri" w:hAnsi="Calibri"/>
+                <w:b/>
+                <w:i w:val="0"/>
+                <w:color w:val="FFFFFF"/>
+                <w:sz w:val="16"/>
+              </w:rPr>
+              <w:t>Licence</w:t>
+            </w:r>
+          </w:p>
+        </w:tc>
+        <w:tc>
+          <w:tcPr>
+            <w:shd w:val="clear" w:color="auto" w:fill="1A365D"/>
+            <w:vAlign w:val="center"/>
+            <w:tcW w:w="1134" w:type="dxa"/>
           </w:tcPr>
           <w:p>
             <w:pPr>
@@ -798,7 +778,7 @@
       <w:tr>
         <w:tc>
           <w:tcPr>
-            <w:tcW w:w="2948" w:type="dxa"/>
+            <w:tcW w:w="2154" w:type="dxa"/>
           </w:tcPr>
           <w:p>
             <w:pPr>
@@ -812,13 +792,439 @@
                 <w:color w:val="000000"/>
                 <w:sz w:val="17"/>
               </w:rPr>
-              <w:t>Galascope 1</w:t>
+              <w:t>Esperia Energy (Tseri)</w:t>
             </w:r>
           </w:p>
         </w:tc>
         <w:tc>
           <w:tcPr>
-            <w:tcW w:w="963" w:type="dxa"/>
+            <w:tcW w:w="793" w:type="dxa"/>
+          </w:tcPr>
+          <w:p>
+            <w:pPr>
+              <w:jc w:val="center"/>
+            </w:pPr>
+            <w:r>
+              <w:rPr>
+                <w:rFonts w:ascii="Calibri" w:hAnsi="Calibri"/>
+                <w:b w:val="0"/>
+                <w:i w:val="0"/>
+                <w:color w:val="000000"/>
+                <w:sz w:val="17"/>
+              </w:rPr>
+              <w:t>Nicosia</w:t>
+            </w:r>
+          </w:p>
+        </w:tc>
+        <w:tc>
+          <w:tcPr>
+            <w:tcW w:w="567" w:type="dxa"/>
+          </w:tcPr>
+          <w:p>
+            <w:pPr>
+              <w:jc w:val="right"/>
+            </w:pPr>
+            <w:r>
+              <w:rPr>
+                <w:rFonts w:ascii="Calibri" w:hAnsi="Calibri"/>
+                <w:b w:val="0"/>
+                <w:i w:val="0"/>
+                <w:color w:val="000000"/>
+                <w:sz w:val="17"/>
+              </w:rPr>
+              <w:t>7.20</w:t>
+            </w:r>
+          </w:p>
+        </w:tc>
+        <w:tc>
+          <w:tcPr>
+            <w:tcW w:w="567" w:type="dxa"/>
+          </w:tcPr>
+          <w:p>
+            <w:pPr>
+              <w:jc w:val="right"/>
+            </w:pPr>
+            <w:r>
+              <w:rPr>
+                <w:rFonts w:ascii="Calibri" w:hAnsi="Calibri"/>
+                <w:b w:val="0"/>
+                <w:i w:val="0"/>
+                <w:color w:val="000000"/>
+                <w:sz w:val="17"/>
+              </w:rPr>
+              <w:t>25.0</w:t>
+            </w:r>
+          </w:p>
+        </w:tc>
+        <w:tc>
+          <w:tcPr>
+            <w:tcW w:w="1020" w:type="dxa"/>
+          </w:tcPr>
+          <w:p>
+            <w:pPr>
+              <w:jc w:val="center"/>
+            </w:pPr>
+            <w:r>
+              <w:rPr>
+                <w:rFonts w:ascii="Calibri" w:hAnsi="Calibri"/>
+                <w:b w:val="0"/>
+                <w:i w:val="0"/>
+                <w:color w:val="000000"/>
+                <w:sz w:val="17"/>
+              </w:rPr>
+              <w:t>2026</w:t>
+            </w:r>
+          </w:p>
+        </w:tc>
+        <w:tc>
+          <w:tcPr>
+            <w:tcW w:w="1134" w:type="dxa"/>
+          </w:tcPr>
+          <w:p>
+            <w:pPr>
+              <w:jc w:val="center"/>
+            </w:pPr>
+            <w:r>
+              <w:rPr>
+                <w:rFonts w:ascii="Calibri" w:hAnsi="Calibri"/>
+                <w:b w:val="0"/>
+                <w:i w:val="0"/>
+                <w:color w:val="000000"/>
+                <w:sz w:val="17"/>
+              </w:rPr>
+              <w:t>Licence ~6 months</w:t>
+            </w:r>
+          </w:p>
+        </w:tc>
+        <w:tc>
+          <w:tcPr>
+            <w:tcW w:w="1134" w:type="dxa"/>
+          </w:tcPr>
+          <w:p>
+            <w:pPr>
+              <w:jc w:val="right"/>
+            </w:pPr>
+            <w:r>
+              <w:rPr>
+                <w:rFonts w:ascii="Calibri" w:hAnsi="Calibri"/>
+                <w:b w:val="0"/>
+                <w:i w:val="0"/>
+                <w:color w:val="000000"/>
+                <w:sz w:val="17"/>
+              </w:rPr>
+              <w:t>€3,073,225*</w:t>
+            </w:r>
+          </w:p>
+        </w:tc>
+      </w:tr>
+      <w:tr>
+        <w:tc>
+          <w:tcPr>
+            <w:tcW w:w="2154" w:type="dxa"/>
+          </w:tcPr>
+          <w:p>
+            <w:pPr>
+              <w:jc w:val="left"/>
+            </w:pPr>
+            <w:r>
+              <w:rPr>
+                <w:rFonts w:ascii="Calibri" w:hAnsi="Calibri"/>
+                <w:b w:val="0"/>
+                <w:i w:val="0"/>
+                <w:color w:val="000000"/>
+                <w:sz w:val="17"/>
+              </w:rPr>
+              <w:t>Esperia Energy (Tseri 2-A)</w:t>
+            </w:r>
+          </w:p>
+        </w:tc>
+        <w:tc>
+          <w:tcPr>
+            <w:tcW w:w="793" w:type="dxa"/>
+          </w:tcPr>
+          <w:p>
+            <w:pPr>
+              <w:jc w:val="center"/>
+            </w:pPr>
+            <w:r>
+              <w:rPr>
+                <w:rFonts w:ascii="Calibri" w:hAnsi="Calibri"/>
+                <w:b w:val="0"/>
+                <w:i w:val="0"/>
+                <w:color w:val="000000"/>
+                <w:sz w:val="17"/>
+              </w:rPr>
+              <w:t>Nicosia</w:t>
+            </w:r>
+          </w:p>
+        </w:tc>
+        <w:tc>
+          <w:tcPr>
+            <w:tcW w:w="567" w:type="dxa"/>
+          </w:tcPr>
+          <w:p>
+            <w:pPr>
+              <w:jc w:val="right"/>
+            </w:pPr>
+            <w:r>
+              <w:rPr>
+                <w:rFonts w:ascii="Calibri" w:hAnsi="Calibri"/>
+                <w:b w:val="0"/>
+                <w:i w:val="0"/>
+                <w:color w:val="000000"/>
+                <w:sz w:val="17"/>
+              </w:rPr>
+              <w:t>2.75</w:t>
+            </w:r>
+          </w:p>
+        </w:tc>
+        <w:tc>
+          <w:tcPr>
+            <w:tcW w:w="567" w:type="dxa"/>
+          </w:tcPr>
+          <w:p>
+            <w:pPr>
+              <w:jc w:val="right"/>
+            </w:pPr>
+            <w:r>
+              <w:rPr>
+                <w:rFonts w:ascii="Calibri" w:hAnsi="Calibri"/>
+                <w:b w:val="0"/>
+                <w:i w:val="0"/>
+                <w:color w:val="000000"/>
+                <w:sz w:val="17"/>
+              </w:rPr>
+              <w:t>10.0</w:t>
+            </w:r>
+          </w:p>
+        </w:tc>
+        <w:tc>
+          <w:tcPr>
+            <w:tcW w:w="1020" w:type="dxa"/>
+          </w:tcPr>
+          <w:p>
+            <w:pPr>
+              <w:jc w:val="center"/>
+            </w:pPr>
+            <w:r>
+              <w:rPr>
+                <w:rFonts w:ascii="Calibri" w:hAnsi="Calibri"/>
+                <w:b w:val="0"/>
+                <w:i w:val="0"/>
+                <w:color w:val="000000"/>
+                <w:sz w:val="17"/>
+              </w:rPr>
+              <w:t>Q3 2026</w:t>
+            </w:r>
+          </w:p>
+        </w:tc>
+        <w:tc>
+          <w:tcPr>
+            <w:tcW w:w="1134" w:type="dxa"/>
+          </w:tcPr>
+          <w:p>
+            <w:pPr>
+              <w:jc w:val="center"/>
+            </w:pPr>
+            <w:r>
+              <w:rPr>
+                <w:rFonts w:ascii="Calibri" w:hAnsi="Calibri"/>
+                <w:b w:val="0"/>
+                <w:i w:val="0"/>
+                <w:color w:val="000000"/>
+                <w:sz w:val="17"/>
+              </w:rPr>
+              <w:t>Fully licensed</w:t>
+            </w:r>
+          </w:p>
+        </w:tc>
+        <w:tc>
+          <w:tcPr>
+            <w:tcW w:w="1134" w:type="dxa"/>
+          </w:tcPr>
+          <w:p>
+            <w:pPr>
+              <w:jc w:val="right"/>
+            </w:pPr>
+            <w:r>
+              <w:rPr>
+                <w:rFonts w:ascii="Calibri" w:hAnsi="Calibri"/>
+                <w:b w:val="0"/>
+                <w:i w:val="0"/>
+                <w:color w:val="000000"/>
+                <w:sz w:val="17"/>
+              </w:rPr>
+              <w:t>€1,206,300*</w:t>
+            </w:r>
+          </w:p>
+        </w:tc>
+      </w:tr>
+      <w:tr>
+        <w:tc>
+          <w:tcPr>
+            <w:tcW w:w="2154" w:type="dxa"/>
+          </w:tcPr>
+          <w:p>
+            <w:pPr>
+              <w:jc w:val="left"/>
+            </w:pPr>
+            <w:r>
+              <w:rPr>
+                <w:rFonts w:ascii="Calibri" w:hAnsi="Calibri"/>
+                <w:b w:val="0"/>
+                <w:i w:val="0"/>
+                <w:color w:val="000000"/>
+                <w:sz w:val="17"/>
+              </w:rPr>
+              <w:t>Esperia Energy (Tseri 3)</w:t>
+            </w:r>
+          </w:p>
+        </w:tc>
+        <w:tc>
+          <w:tcPr>
+            <w:tcW w:w="793" w:type="dxa"/>
+          </w:tcPr>
+          <w:p>
+            <w:pPr>
+              <w:jc w:val="center"/>
+            </w:pPr>
+            <w:r>
+              <w:rPr>
+                <w:rFonts w:ascii="Calibri" w:hAnsi="Calibri"/>
+                <w:b w:val="0"/>
+                <w:i w:val="0"/>
+                <w:color w:val="000000"/>
+                <w:sz w:val="17"/>
+              </w:rPr>
+              <w:t>Nicosia</w:t>
+            </w:r>
+          </w:p>
+        </w:tc>
+        <w:tc>
+          <w:tcPr>
+            <w:tcW w:w="567" w:type="dxa"/>
+          </w:tcPr>
+          <w:p>
+            <w:pPr>
+              <w:jc w:val="right"/>
+            </w:pPr>
+            <w:r>
+              <w:rPr>
+                <w:rFonts w:ascii="Calibri" w:hAnsi="Calibri"/>
+                <w:b w:val="0"/>
+                <w:i w:val="0"/>
+                <w:color w:val="000000"/>
+                <w:sz w:val="17"/>
+              </w:rPr>
+              <w:t>4.75</w:t>
+            </w:r>
+          </w:p>
+        </w:tc>
+        <w:tc>
+          <w:tcPr>
+            <w:tcW w:w="567" w:type="dxa"/>
+          </w:tcPr>
+          <w:p>
+            <w:pPr>
+              <w:jc w:val="right"/>
+            </w:pPr>
+            <w:r>
+              <w:rPr>
+                <w:rFonts w:ascii="Calibri" w:hAnsi="Calibri"/>
+                <w:b w:val="0"/>
+                <w:i w:val="0"/>
+                <w:color w:val="000000"/>
+                <w:sz w:val="17"/>
+              </w:rPr>
+              <w:t>20.0</w:t>
+            </w:r>
+          </w:p>
+        </w:tc>
+        <w:tc>
+          <w:tcPr>
+            <w:tcW w:w="1020" w:type="dxa"/>
+          </w:tcPr>
+          <w:p>
+            <w:pPr>
+              <w:jc w:val="center"/>
+            </w:pPr>
+            <w:r>
+              <w:rPr>
+                <w:rFonts w:ascii="Calibri" w:hAnsi="Calibri"/>
+                <w:b w:val="0"/>
+                <w:i w:val="0"/>
+                <w:color w:val="000000"/>
+                <w:sz w:val="17"/>
+              </w:rPr>
+              <w:t>Q3 2026</w:t>
+            </w:r>
+          </w:p>
+        </w:tc>
+        <w:tc>
+          <w:tcPr>
+            <w:tcW w:w="1134" w:type="dxa"/>
+          </w:tcPr>
+          <w:p>
+            <w:pPr>
+              <w:jc w:val="center"/>
+            </w:pPr>
+            <w:r>
+              <w:rPr>
+                <w:rFonts w:ascii="Calibri" w:hAnsi="Calibri"/>
+                <w:b w:val="0"/>
+                <w:i w:val="0"/>
+                <w:color w:val="000000"/>
+                <w:sz w:val="17"/>
+              </w:rPr>
+              <w:t>Fully licensed</w:t>
+            </w:r>
+          </w:p>
+        </w:tc>
+        <w:tc>
+          <w:tcPr>
+            <w:tcW w:w="1134" w:type="dxa"/>
+          </w:tcPr>
+          <w:p>
+            <w:pPr>
+              <w:jc w:val="right"/>
+            </w:pPr>
+            <w:r>
+              <w:rPr>
+                <w:rFonts w:ascii="Calibri" w:hAnsi="Calibri"/>
+                <w:b w:val="0"/>
+                <w:i w:val="0"/>
+                <w:color w:val="000000"/>
+                <w:sz w:val="17"/>
+              </w:rPr>
+              <w:t>€2,238,000*</w:t>
+            </w:r>
+          </w:p>
+        </w:tc>
+      </w:tr>
+      <w:tr>
+        <w:tc>
+          <w:tcPr>
+            <w:tcW w:w="2154" w:type="dxa"/>
+          </w:tcPr>
+          <w:p>
+            <w:pPr>
+              <w:jc w:val="left"/>
+            </w:pPr>
+            <w:r>
+              <w:rPr>
+                <w:rFonts w:ascii="Calibri" w:hAnsi="Calibri"/>
+                <w:b w:val="0"/>
+                <w:i w:val="0"/>
+                <w:color w:val="000000"/>
+                <w:sz w:val="17"/>
+              </w:rPr>
+              <w:t>Esperia Energy (Famagusta)</w:t>
+            </w:r>
+          </w:p>
+        </w:tc>
+        <w:tc>
+          <w:tcPr>
+            <w:tcW w:w="793" w:type="dxa"/>
           </w:tcPr>
           <w:p>
             <w:pPr>
@@ -838,7 +1244,7 @@
         </w:tc>
         <w:tc>
           <w:tcPr>
-            <w:tcW w:w="737" w:type="dxa"/>
+            <w:tcW w:w="567" w:type="dxa"/>
           </w:tcPr>
           <w:p>
             <w:pPr>
@@ -852,13 +1258,13 @@
                 <w:color w:val="000000"/>
                 <w:sz w:val="17"/>
               </w:rPr>
-              <w:t>5.00</w:t>
+              <w:t>6.50</w:t>
             </w:r>
           </w:p>
         </w:tc>
         <w:tc>
           <w:tcPr>
-            <w:tcW w:w="737" w:type="dxa"/>
+            <w:tcW w:w="567" w:type="dxa"/>
           </w:tcPr>
           <w:p>
             <w:pPr>
@@ -878,7 +1284,47 @@
         </w:tc>
         <w:tc>
           <w:tcPr>
-            <w:tcW w:w="567" w:type="dxa"/>
+            <w:tcW w:w="1020" w:type="dxa"/>
+          </w:tcPr>
+          <w:p>
+            <w:pPr>
+              <w:jc w:val="center"/>
+            </w:pPr>
+            <w:r>
+              <w:rPr>
+                <w:rFonts w:ascii="Calibri" w:hAnsi="Calibri"/>
+                <w:b w:val="0"/>
+                <w:i w:val="0"/>
+                <w:color w:val="000000"/>
+                <w:sz w:val="17"/>
+              </w:rPr>
+              <w:t>Q4 2026</w:t>
+            </w:r>
+          </w:p>
+        </w:tc>
+        <w:tc>
+          <w:tcPr>
+            <w:tcW w:w="1134" w:type="dxa"/>
+          </w:tcPr>
+          <w:p>
+            <w:pPr>
+              <w:jc w:val="center"/>
+            </w:pPr>
+            <w:r>
+              <w:rPr>
+                <w:rFonts w:ascii="Calibri" w:hAnsi="Calibri"/>
+                <w:b w:val="0"/>
+                <w:i w:val="0"/>
+                <w:color w:val="000000"/>
+                <w:sz w:val="17"/>
+              </w:rPr>
+              <w:t>Per EPC schedule</w:t>
+            </w:r>
+          </w:p>
+        </w:tc>
+        <w:tc>
+          <w:tcPr>
+            <w:tcW w:w="1134" w:type="dxa"/>
           </w:tcPr>
           <w:p>
             <w:pPr>
@@ -892,149 +1338,7 @@
                 <w:color w:val="000000"/>
                 <w:sz w:val="17"/>
               </w:rPr>
-              <w:t>5</w:t>
-            </w:r>
-          </w:p>
-        </w:tc>
-        <w:tc>
-          <w:tcPr>
-            <w:tcW w:w="1984" w:type="dxa"/>
-          </w:tcPr>
-          <w:p>
-            <w:pPr>
-              <w:jc w:val="right"/>
-            </w:pPr>
-            <w:r>
-              <w:rPr>
-                <w:rFonts w:ascii="Calibri" w:hAnsi="Calibri"/>
-                <w:b w:val="0"/>
-                <w:i w:val="0"/>
-                <w:color w:val="000000"/>
-                <w:sz w:val="17"/>
-              </w:rPr>
-              <w:t>€2,238,000</w:t>
-            </w:r>
-          </w:p>
-        </w:tc>
-      </w:tr>
-      <w:tr>
-        <w:tc>
-          <w:tcPr>
-            <w:tcW w:w="2948" w:type="dxa"/>
-          </w:tcPr>
-          <w:p>
-            <w:pPr>
-              <w:jc w:val="left"/>
-            </w:pPr>
-            <w:r>
-              <w:rPr>
-                <w:rFonts w:ascii="Calibri" w:hAnsi="Calibri"/>
-                <w:b w:val="0"/>
-                <w:i w:val="0"/>
-                <w:color w:val="000000"/>
-                <w:sz w:val="17"/>
-              </w:rPr>
-              <w:t>Galascope 2</w:t>
-            </w:r>
-          </w:p>
-        </w:tc>
-        <w:tc>
-          <w:tcPr>
-            <w:tcW w:w="963" w:type="dxa"/>
-          </w:tcPr>
-          <w:p>
-            <w:pPr>
-              <w:jc w:val="center"/>
-            </w:pPr>
-            <w:r>
-              <w:rPr>
-                <w:rFonts w:ascii="Calibri" w:hAnsi="Calibri"/>
-                <w:b w:val="0"/>
-                <w:i w:val="0"/>
-                <w:color w:val="000000"/>
-                <w:sz w:val="17"/>
-              </w:rPr>
-              <w:t>Famagusta</w:t>
-            </w:r>
-          </w:p>
-        </w:tc>
-        <w:tc>
-          <w:tcPr>
-            <w:tcW w:w="737" w:type="dxa"/>
-          </w:tcPr>
-          <w:p>
-            <w:pPr>
-              <w:jc w:val="right"/>
-            </w:pPr>
-            <w:r>
-              <w:rPr>
-                <w:rFonts w:ascii="Calibri" w:hAnsi="Calibri"/>
-                <w:b w:val="0"/>
-                <w:i w:val="0"/>
-                <w:color w:val="000000"/>
-                <w:sz w:val="17"/>
-              </w:rPr>
-              <w:t>2.50</w:t>
-            </w:r>
-          </w:p>
-        </w:tc>
-        <w:tc>
-          <w:tcPr>
-            <w:tcW w:w="737" w:type="dxa"/>
-          </w:tcPr>
-          <w:p>
-            <w:pPr>
-              <w:jc w:val="right"/>
-            </w:pPr>
-            <w:r>
-              <w:rPr>
-                <w:rFonts w:ascii="Calibri" w:hAnsi="Calibri"/>
-                <w:b w:val="0"/>
-                <w:i w:val="0"/>
-                <w:color w:val="000000"/>
-                <w:sz w:val="17"/>
-              </w:rPr>
-              <w:t>10.0</w:t>
-            </w:r>
-          </w:p>
-        </w:tc>
-        <w:tc>
-          <w:tcPr>
-            <w:tcW w:w="567" w:type="dxa"/>
-          </w:tcPr>
-          <w:p>
-            <w:pPr>
-              <w:jc w:val="right"/>
-            </w:pPr>
-            <w:r>
-              <w:rPr>
-                <w:rFonts w:ascii="Calibri" w:hAnsi="Calibri"/>
-                <w:b w:val="0"/>
-                <w:i w:val="0"/>
-                <w:color w:val="000000"/>
-                <w:sz w:val="17"/>
-              </w:rPr>
-              <w:t>3</w:t>
-            </w:r>
-          </w:p>
-        </w:tc>
-        <w:tc>
-          <w:tcPr>
-            <w:tcW w:w="1984" w:type="dxa"/>
-          </w:tcPr>
-          <w:p>
-            <w:pPr>
-              <w:jc w:val="right"/>
-            </w:pPr>
-            <w:r>
-              <w:rPr>
-                <w:rFonts w:ascii="Calibri" w:hAnsi="Calibri"/>
-                <w:b w:val="0"/>
-                <w:i w:val="0"/>
-                <w:color w:val="000000"/>
-                <w:sz w:val="17"/>
-              </w:rPr>
-              <w:t>€1,206,300</w:t>
+              <w:t>€2,374,920*</w:t>
             </w:r>
           </w:p>
         </w:tc>
@@ -1043,7 +1347,7 @@
         <w:tc>
           <w:tcPr>
             <w:shd w:val="clear" w:color="auto" w:fill="1A365D"/>
-            <w:tcW w:w="2948" w:type="dxa"/>
+            <w:tcW w:w="2154" w:type="dxa"/>
           </w:tcPr>
           <w:p>
             <w:pPr>
@@ -1057,14 +1361,14 @@
                 <w:color w:val="FFFFFF"/>
                 <w:sz w:val="17"/>
               </w:rPr>
-              <w:t>Galascope Ltd — Batch 1 (confirmed pricing May 2026) — Subtotal</w:t>
+              <w:t>Batch 1 — 2026 — Subtotal</w:t>
             </w:r>
           </w:p>
         </w:tc>
         <w:tc>
           <w:tcPr>
             <w:shd w:val="clear" w:color="auto" w:fill="1A365D"/>
-            <w:tcW w:w="963" w:type="dxa"/>
+            <w:tcW w:w="793" w:type="dxa"/>
           </w:tcPr>
           <w:p>
             <w:pPr>
@@ -1078,48 +1382,6 @@
                 <w:color w:val="FFFFFF"/>
                 <w:sz w:val="17"/>
               </w:rPr>
-            </w:r>
-          </w:p>
-        </w:tc>
-        <w:tc>
-          <w:tcPr>
-            <w:shd w:val="clear" w:color="auto" w:fill="1A365D"/>
-            <w:tcW w:w="737" w:type="dxa"/>
-          </w:tcPr>
-          <w:p>
-            <w:pPr>
-              <w:jc w:val="right"/>
-            </w:pPr>
-            <w:r>
-              <w:rPr>
-                <w:rFonts w:ascii="Calibri" w:hAnsi="Calibri"/>
-                <w:b/>
-                <w:i w:val="0"/>
-                <w:color w:val="FFFFFF"/>
-                <w:sz w:val="17"/>
-              </w:rPr>
-              <w:t>7.50</w:t>
-            </w:r>
-          </w:p>
-        </w:tc>
-        <w:tc>
-          <w:tcPr>
-            <w:shd w:val="clear" w:color="auto" w:fill="1A365D"/>
-            <w:tcW w:w="737" w:type="dxa"/>
-          </w:tcPr>
-          <w:p>
-            <w:pPr>
-              <w:jc w:val="right"/>
-            </w:pPr>
-            <w:r>
-              <w:rPr>
-                <w:rFonts w:ascii="Calibri" w:hAnsi="Calibri"/>
-                <w:b/>
-                <w:i w:val="0"/>
-                <w:color w:val="FFFFFF"/>
-                <w:sz w:val="17"/>
-              </w:rPr>
-              <w:t>30.0</w:t>
             </w:r>
           </w:p>
         </w:tc>
@@ -1140,14 +1402,14 @@
                 <w:color w:val="FFFFFF"/>
                 <w:sz w:val="17"/>
               </w:rPr>
-              <w:t>8</w:t>
+              <w:t>21.20</w:t>
             </w:r>
           </w:p>
         </w:tc>
         <w:tc>
           <w:tcPr>
             <w:shd w:val="clear" w:color="auto" w:fill="1A365D"/>
-            <w:tcW w:w="1984" w:type="dxa"/>
+            <w:tcW w:w="567" w:type="dxa"/>
           </w:tcPr>
           <w:p>
             <w:pPr>
@@ -1161,7 +1423,68 @@
                 <w:color w:val="FFFFFF"/>
                 <w:sz w:val="17"/>
               </w:rPr>
-              <w:t>€3,444,300</w:t>
+              <w:t>75.0</w:t>
+            </w:r>
+          </w:p>
+        </w:tc>
+        <w:tc>
+          <w:tcPr>
+            <w:shd w:val="clear" w:color="auto" w:fill="1A365D"/>
+            <w:tcW w:w="1020" w:type="dxa"/>
+          </w:tcPr>
+          <w:p>
+            <w:pPr>
+              <w:jc w:val="center"/>
+            </w:pPr>
+            <w:r>
+              <w:rPr>
+                <w:rFonts w:ascii="Calibri" w:hAnsi="Calibri"/>
+                <w:b/>
+                <w:i w:val="0"/>
+                <w:color w:val="FFFFFF"/>
+                <w:sz w:val="17"/>
+              </w:rPr>
+            </w:r>
+          </w:p>
+        </w:tc>
+        <w:tc>
+          <w:tcPr>
+            <w:shd w:val="clear" w:color="auto" w:fill="1A365D"/>
+            <w:tcW w:w="1134" w:type="dxa"/>
+          </w:tcPr>
+          <w:p>
+            <w:pPr>
+              <w:jc w:val="center"/>
+            </w:pPr>
+            <w:r>
+              <w:rPr>
+                <w:rFonts w:ascii="Calibri" w:hAnsi="Calibri"/>
+                <w:b/>
+                <w:i w:val="0"/>
+                <w:color w:val="FFFFFF"/>
+                <w:sz w:val="17"/>
+              </w:rPr>
+            </w:r>
+          </w:p>
+        </w:tc>
+        <w:tc>
+          <w:tcPr>
+            <w:shd w:val="clear" w:color="auto" w:fill="1A365D"/>
+            <w:tcW w:w="1134" w:type="dxa"/>
+          </w:tcPr>
+          <w:p>
+            <w:pPr>
+              <w:jc w:val="right"/>
+            </w:pPr>
+            <w:r>
+              <w:rPr>
+                <w:rFonts w:ascii="Calibri" w:hAnsi="Calibri"/>
+                <w:b/>
+                <w:i w:val="0"/>
+                <w:color w:val="FFFFFF"/>
+                <w:sz w:val="17"/>
+              </w:rPr>
+              <w:t>€8,892,445</w:t>
             </w:r>
           </w:p>
         </w:tc>
@@ -1169,7 +1492,7 @@
       <w:tr>
         <w:tc>
           <w:tcPr>
-            <w:tcW w:w="2948" w:type="dxa"/>
+            <w:tcW w:w="2154" w:type="dxa"/>
           </w:tcPr>
           <w:p>
             <w:pPr>
@@ -1183,13 +1506,13 @@
                 <w:color w:val="000000"/>
                 <w:sz w:val="17"/>
               </w:rPr>
-              <w:t>Esperia Energy (Famagusta)</w:t>
+              <w:t>Esperia Green Energy (Limassol)</w:t>
             </w:r>
           </w:p>
         </w:tc>
         <w:tc>
           <w:tcPr>
-            <w:tcW w:w="963" w:type="dxa"/>
+            <w:tcW w:w="793" w:type="dxa"/>
           </w:tcPr>
           <w:p>
             <w:pPr>
@@ -1203,47 +1526,7 @@
                 <w:color w:val="000000"/>
                 <w:sz w:val="17"/>
               </w:rPr>
-              <w:t>Famagusta</w:t>
-            </w:r>
-          </w:p>
-        </w:tc>
-        <w:tc>
-          <w:tcPr>
-            <w:tcW w:w="737" w:type="dxa"/>
-          </w:tcPr>
-          <w:p>
-            <w:pPr>
-              <w:jc w:val="right"/>
-            </w:pPr>
-            <w:r>
-              <w:rPr>
-                <w:rFonts w:ascii="Calibri" w:hAnsi="Calibri"/>
-                <w:b w:val="0"/>
-                <w:i w:val="0"/>
-                <w:color w:val="000000"/>
-                <w:sz w:val="17"/>
-              </w:rPr>
-              <w:t>6.50</w:t>
-            </w:r>
-          </w:p>
-        </w:tc>
-        <w:tc>
-          <w:tcPr>
-            <w:tcW w:w="737" w:type="dxa"/>
-          </w:tcPr>
-          <w:p>
-            <w:pPr>
-              <w:jc w:val="right"/>
-            </w:pPr>
-            <w:r>
-              <w:rPr>
-                <w:rFonts w:ascii="Calibri" w:hAnsi="Calibri"/>
-                <w:b w:val="0"/>
-                <w:i w:val="0"/>
-                <w:color w:val="000000"/>
-                <w:sz w:val="17"/>
-              </w:rPr>
-              <w:t>20.0</w:t>
+              <w:t>Limassol</w:t>
             </w:r>
           </w:p>
         </w:tc>
@@ -1263,95 +1546,13 @@
                 <w:color w:val="000000"/>
                 <w:sz w:val="17"/>
               </w:rPr>
-              <w:t>4</w:t>
-            </w:r>
-          </w:p>
-        </w:tc>
-        <w:tc>
-          <w:tcPr>
-            <w:tcW w:w="1984" w:type="dxa"/>
-          </w:tcPr>
-          <w:p>
-            <w:pPr>
-              <w:jc w:val="right"/>
-            </w:pPr>
-            <w:r>
-              <w:rPr>
-                <w:rFonts w:ascii="Calibri" w:hAnsi="Calibri"/>
-                <w:b w:val="0"/>
-                <w:i w:val="0"/>
-                <w:color w:val="000000"/>
-                <w:sz w:val="17"/>
-              </w:rPr>
-              <w:t>€2,316,815</w:t>
-            </w:r>
-          </w:p>
-        </w:tc>
-      </w:tr>
-      <w:tr>
-        <w:tc>
-          <w:tcPr>
-            <w:tcW w:w="2948" w:type="dxa"/>
-          </w:tcPr>
-          <w:p>
-            <w:pPr>
-              <w:jc w:val="left"/>
-            </w:pPr>
-            <w:r>
-              <w:rPr>
-                <w:rFonts w:ascii="Calibri" w:hAnsi="Calibri"/>
-                <w:b w:val="0"/>
-                <w:i w:val="0"/>
-                <w:color w:val="000000"/>
-                <w:sz w:val="17"/>
-              </w:rPr>
-              <w:t>Esperia Green Energy (Limassol)</w:t>
-            </w:r>
-          </w:p>
-        </w:tc>
-        <w:tc>
-          <w:tcPr>
-            <w:tcW w:w="963" w:type="dxa"/>
-          </w:tcPr>
-          <w:p>
-            <w:pPr>
-              <w:jc w:val="center"/>
-            </w:pPr>
-            <w:r>
-              <w:rPr>
-                <w:rFonts w:ascii="Calibri" w:hAnsi="Calibri"/>
-                <w:b w:val="0"/>
-                <w:i w:val="0"/>
-                <w:color w:val="000000"/>
-                <w:sz w:val="17"/>
-              </w:rPr>
-              <w:t>Limassol</w:t>
-            </w:r>
-          </w:p>
-        </w:tc>
-        <w:tc>
-          <w:tcPr>
-            <w:tcW w:w="737" w:type="dxa"/>
-          </w:tcPr>
-          <w:p>
-            <w:pPr>
-              <w:jc w:val="right"/>
-            </w:pPr>
-            <w:r>
-              <w:rPr>
-                <w:rFonts w:ascii="Calibri" w:hAnsi="Calibri"/>
-                <w:b w:val="0"/>
-                <w:i w:val="0"/>
-                <w:color w:val="000000"/>
-                <w:sz w:val="17"/>
-              </w:rPr>
               <w:t>8.00</w:t>
             </w:r>
           </w:p>
         </w:tc>
         <w:tc>
           <w:tcPr>
-            <w:tcW w:w="737" w:type="dxa"/>
+            <w:tcW w:w="567" w:type="dxa"/>
           </w:tcPr>
           <w:p>
             <w:pPr>
@@ -1371,11 +1572,11 @@
         </w:tc>
         <w:tc>
           <w:tcPr>
-            <w:tcW w:w="567" w:type="dxa"/>
+            <w:tcW w:w="1020" w:type="dxa"/>
           </w:tcPr>
           <w:p>
             <w:pPr>
-              <w:jc w:val="right"/>
+              <w:jc w:val="center"/>
             </w:pPr>
             <w:r>
               <w:rPr>
@@ -1385,13 +1586,33 @@
                 <w:color w:val="000000"/>
                 <w:sz w:val="17"/>
               </w:rPr>
-              <w:t>12</w:t>
+              <w:t>Q2 2027</w:t>
             </w:r>
           </w:p>
         </w:tc>
         <w:tc>
           <w:tcPr>
-            <w:tcW w:w="1984" w:type="dxa"/>
+            <w:tcW w:w="1134" w:type="dxa"/>
+          </w:tcPr>
+          <w:p>
+            <w:pPr>
+              <w:jc w:val="center"/>
+            </w:pPr>
+            <w:r>
+              <w:rPr>
+                <w:rFonts w:ascii="Calibri" w:hAnsi="Calibri"/>
+                <w:b w:val="0"/>
+                <w:i w:val="0"/>
+                <w:color w:val="000000"/>
+                <w:sz w:val="17"/>
+              </w:rPr>
+              <w:t>Per EPC schedule</w:t>
+            </w:r>
+          </w:p>
+        </w:tc>
+        <w:tc>
+          <w:tcPr>
+            <w:tcW w:w="1134" w:type="dxa"/>
           </w:tcPr>
           <w:p>
             <w:pPr>
@@ -1413,7 +1634,437 @@
       <w:tr>
         <w:tc>
           <w:tcPr>
-            <w:tcW w:w="2948" w:type="dxa"/>
+            <w:tcW w:w="2154" w:type="dxa"/>
+          </w:tcPr>
+          <w:p>
+            <w:pPr>
+              <w:jc w:val="left"/>
+            </w:pPr>
+            <w:r>
+              <w:rPr>
+                <w:rFonts w:ascii="Calibri" w:hAnsi="Calibri"/>
+                <w:b w:val="0"/>
+                <w:i w:val="0"/>
+                <w:color w:val="000000"/>
+                <w:sz w:val="17"/>
+              </w:rPr>
+              <w:t>Esperia Energy (Tseri 2-B)</w:t>
+            </w:r>
+          </w:p>
+        </w:tc>
+        <w:tc>
+          <w:tcPr>
+            <w:tcW w:w="793" w:type="dxa"/>
+          </w:tcPr>
+          <w:p>
+            <w:pPr>
+              <w:jc w:val="center"/>
+            </w:pPr>
+            <w:r>
+              <w:rPr>
+                <w:rFonts w:ascii="Calibri" w:hAnsi="Calibri"/>
+                <w:b w:val="0"/>
+                <w:i w:val="0"/>
+                <w:color w:val="000000"/>
+                <w:sz w:val="17"/>
+              </w:rPr>
+              <w:t>Nicosia</w:t>
+            </w:r>
+          </w:p>
+        </w:tc>
+        <w:tc>
+          <w:tcPr>
+            <w:tcW w:w="567" w:type="dxa"/>
+          </w:tcPr>
+          <w:p>
+            <w:pPr>
+              <w:jc w:val="right"/>
+            </w:pPr>
+            <w:r>
+              <w:rPr>
+                <w:rFonts w:ascii="Calibri" w:hAnsi="Calibri"/>
+                <w:b w:val="0"/>
+                <w:i w:val="0"/>
+                <w:color w:val="000000"/>
+                <w:sz w:val="17"/>
+              </w:rPr>
+              <w:t>7.99</w:t>
+            </w:r>
+          </w:p>
+        </w:tc>
+        <w:tc>
+          <w:tcPr>
+            <w:tcW w:w="567" w:type="dxa"/>
+          </w:tcPr>
+          <w:p>
+            <w:pPr>
+              <w:jc w:val="right"/>
+            </w:pPr>
+            <w:r>
+              <w:rPr>
+                <w:rFonts w:ascii="Calibri" w:hAnsi="Calibri"/>
+                <w:b w:val="0"/>
+                <w:i w:val="0"/>
+                <w:color w:val="000000"/>
+                <w:sz w:val="17"/>
+              </w:rPr>
+              <w:t>30.0</w:t>
+            </w:r>
+          </w:p>
+        </w:tc>
+        <w:tc>
+          <w:tcPr>
+            <w:tcW w:w="1020" w:type="dxa"/>
+          </w:tcPr>
+          <w:p>
+            <w:pPr>
+              <w:jc w:val="center"/>
+            </w:pPr>
+            <w:r>
+              <w:rPr>
+                <w:rFonts w:ascii="Calibri" w:hAnsi="Calibri"/>
+                <w:b w:val="0"/>
+                <w:i w:val="0"/>
+                <w:color w:val="000000"/>
+                <w:sz w:val="17"/>
+              </w:rPr>
+              <w:t>2027</w:t>
+            </w:r>
+          </w:p>
+        </w:tc>
+        <w:tc>
+          <w:tcPr>
+            <w:tcW w:w="1134" w:type="dxa"/>
+          </w:tcPr>
+          <w:p>
+            <w:pPr>
+              <w:jc w:val="center"/>
+            </w:pPr>
+            <w:r>
+              <w:rPr>
+                <w:rFonts w:ascii="Calibri" w:hAnsi="Calibri"/>
+                <w:b w:val="0"/>
+                <w:i w:val="0"/>
+                <w:color w:val="000000"/>
+                <w:sz w:val="17"/>
+              </w:rPr>
+              <w:t>~9 months from licensing</w:t>
+            </w:r>
+          </w:p>
+        </w:tc>
+        <w:tc>
+          <w:tcPr>
+            <w:tcW w:w="1134" w:type="dxa"/>
+          </w:tcPr>
+          <w:p>
+            <w:pPr>
+              <w:jc w:val="right"/>
+            </w:pPr>
+            <w:r>
+              <w:rPr>
+                <w:rFonts w:ascii="Calibri" w:hAnsi="Calibri"/>
+                <w:b w:val="0"/>
+                <w:i w:val="0"/>
+                <w:color w:val="000000"/>
+                <w:sz w:val="17"/>
+              </w:rPr>
+              <w:t>€3,687,870*</w:t>
+            </w:r>
+          </w:p>
+        </w:tc>
+      </w:tr>
+      <w:tr>
+        <w:tc>
+          <w:tcPr>
+            <w:tcW w:w="2154" w:type="dxa"/>
+          </w:tcPr>
+          <w:p>
+            <w:pPr>
+              <w:jc w:val="left"/>
+            </w:pPr>
+            <w:r>
+              <w:rPr>
+                <w:rFonts w:ascii="Calibri" w:hAnsi="Calibri"/>
+                <w:b w:val="0"/>
+                <w:i w:val="0"/>
+                <w:color w:val="000000"/>
+                <w:sz w:val="17"/>
+              </w:rPr>
+              <w:t>Esperia Energy (Tseri 2-C)</w:t>
+            </w:r>
+          </w:p>
+        </w:tc>
+        <w:tc>
+          <w:tcPr>
+            <w:tcW w:w="793" w:type="dxa"/>
+          </w:tcPr>
+          <w:p>
+            <w:pPr>
+              <w:jc w:val="center"/>
+            </w:pPr>
+            <w:r>
+              <w:rPr>
+                <w:rFonts w:ascii="Calibri" w:hAnsi="Calibri"/>
+                <w:b w:val="0"/>
+                <w:i w:val="0"/>
+                <w:color w:val="000000"/>
+                <w:sz w:val="17"/>
+              </w:rPr>
+              <w:t>Nicosia</w:t>
+            </w:r>
+          </w:p>
+        </w:tc>
+        <w:tc>
+          <w:tcPr>
+            <w:tcW w:w="567" w:type="dxa"/>
+          </w:tcPr>
+          <w:p>
+            <w:pPr>
+              <w:jc w:val="right"/>
+            </w:pPr>
+            <w:r>
+              <w:rPr>
+                <w:rFonts w:ascii="Calibri" w:hAnsi="Calibri"/>
+                <w:b w:val="0"/>
+                <w:i w:val="0"/>
+                <w:color w:val="000000"/>
+                <w:sz w:val="17"/>
+              </w:rPr>
+              <w:t>6.30</w:t>
+            </w:r>
+          </w:p>
+        </w:tc>
+        <w:tc>
+          <w:tcPr>
+            <w:tcW w:w="567" w:type="dxa"/>
+          </w:tcPr>
+          <w:p>
+            <w:pPr>
+              <w:jc w:val="right"/>
+            </w:pPr>
+            <w:r>
+              <w:rPr>
+                <w:rFonts w:ascii="Calibri" w:hAnsi="Calibri"/>
+                <w:b w:val="0"/>
+                <w:i w:val="0"/>
+                <w:color w:val="000000"/>
+                <w:sz w:val="17"/>
+              </w:rPr>
+              <w:t>25.0</w:t>
+            </w:r>
+          </w:p>
+        </w:tc>
+        <w:tc>
+          <w:tcPr>
+            <w:tcW w:w="1020" w:type="dxa"/>
+          </w:tcPr>
+          <w:p>
+            <w:pPr>
+              <w:jc w:val="center"/>
+            </w:pPr>
+            <w:r>
+              <w:rPr>
+                <w:rFonts w:ascii="Calibri" w:hAnsi="Calibri"/>
+                <w:b w:val="0"/>
+                <w:i w:val="0"/>
+                <w:color w:val="000000"/>
+                <w:sz w:val="17"/>
+              </w:rPr>
+              <w:t>2027</w:t>
+            </w:r>
+          </w:p>
+        </w:tc>
+        <w:tc>
+          <w:tcPr>
+            <w:tcW w:w="1134" w:type="dxa"/>
+          </w:tcPr>
+          <w:p>
+            <w:pPr>
+              <w:jc w:val="center"/>
+            </w:pPr>
+            <w:r>
+              <w:rPr>
+                <w:rFonts w:ascii="Calibri" w:hAnsi="Calibri"/>
+                <w:b w:val="0"/>
+                <w:i w:val="0"/>
+                <w:color w:val="000000"/>
+                <w:sz w:val="17"/>
+              </w:rPr>
+              <w:t>Licence ~6 months</w:t>
+            </w:r>
+          </w:p>
+        </w:tc>
+        <w:tc>
+          <w:tcPr>
+            <w:tcW w:w="1134" w:type="dxa"/>
+          </w:tcPr>
+          <w:p>
+            <w:pPr>
+              <w:jc w:val="right"/>
+            </w:pPr>
+            <w:r>
+              <w:rPr>
+                <w:rFonts w:ascii="Calibri" w:hAnsi="Calibri"/>
+                <w:b w:val="0"/>
+                <w:i w:val="0"/>
+                <w:color w:val="000000"/>
+                <w:sz w:val="17"/>
+              </w:rPr>
+              <w:t>€3,073,225*</w:t>
+            </w:r>
+          </w:p>
+        </w:tc>
+      </w:tr>
+      <w:tr>
+        <w:tc>
+          <w:tcPr>
+            <w:shd w:val="clear" w:color="auto" w:fill="1A365D"/>
+            <w:tcW w:w="2154" w:type="dxa"/>
+          </w:tcPr>
+          <w:p>
+            <w:pPr>
+              <w:jc w:val="left"/>
+            </w:pPr>
+            <w:r>
+              <w:rPr>
+                <w:rFonts w:ascii="Calibri" w:hAnsi="Calibri"/>
+                <w:b/>
+                <w:i w:val="0"/>
+                <w:color w:val="FFFFFF"/>
+                <w:sz w:val="17"/>
+              </w:rPr>
+              <w:t>Batch 2 — 2027 — Subtotal</w:t>
+            </w:r>
+          </w:p>
+        </w:tc>
+        <w:tc>
+          <w:tcPr>
+            <w:shd w:val="clear" w:color="auto" w:fill="1A365D"/>
+            <w:tcW w:w="793" w:type="dxa"/>
+          </w:tcPr>
+          <w:p>
+            <w:pPr>
+              <w:jc w:val="center"/>
+            </w:pPr>
+            <w:r>
+              <w:rPr>
+                <w:rFonts w:ascii="Calibri" w:hAnsi="Calibri"/>
+                <w:b/>
+                <w:i w:val="0"/>
+                <w:color w:val="FFFFFF"/>
+                <w:sz w:val="17"/>
+              </w:rPr>
+            </w:r>
+          </w:p>
+        </w:tc>
+        <w:tc>
+          <w:tcPr>
+            <w:shd w:val="clear" w:color="auto" w:fill="1A365D"/>
+            <w:tcW w:w="567" w:type="dxa"/>
+          </w:tcPr>
+          <w:p>
+            <w:pPr>
+              <w:jc w:val="right"/>
+            </w:pPr>
+            <w:r>
+              <w:rPr>
+                <w:rFonts w:ascii="Calibri" w:hAnsi="Calibri"/>
+                <w:b/>
+                <w:i w:val="0"/>
+                <w:color w:val="FFFFFF"/>
+                <w:sz w:val="17"/>
+              </w:rPr>
+              <w:t>22.29</w:t>
+            </w:r>
+          </w:p>
+        </w:tc>
+        <w:tc>
+          <w:tcPr>
+            <w:shd w:val="clear" w:color="auto" w:fill="1A365D"/>
+            <w:tcW w:w="567" w:type="dxa"/>
+          </w:tcPr>
+          <w:p>
+            <w:pPr>
+              <w:jc w:val="right"/>
+            </w:pPr>
+            <w:r>
+              <w:rPr>
+                <w:rFonts w:ascii="Calibri" w:hAnsi="Calibri"/>
+                <w:b/>
+                <w:i w:val="0"/>
+                <w:color w:val="FFFFFF"/>
+                <w:sz w:val="17"/>
+              </w:rPr>
+              <w:t>115.0</w:t>
+            </w:r>
+          </w:p>
+        </w:tc>
+        <w:tc>
+          <w:tcPr>
+            <w:shd w:val="clear" w:color="auto" w:fill="1A365D"/>
+            <w:tcW w:w="1020" w:type="dxa"/>
+          </w:tcPr>
+          <w:p>
+            <w:pPr>
+              <w:jc w:val="center"/>
+            </w:pPr>
+            <w:r>
+              <w:rPr>
+                <w:rFonts w:ascii="Calibri" w:hAnsi="Calibri"/>
+                <w:b/>
+                <w:i w:val="0"/>
+                <w:color w:val="FFFFFF"/>
+                <w:sz w:val="17"/>
+              </w:rPr>
+            </w:r>
+          </w:p>
+        </w:tc>
+        <w:tc>
+          <w:tcPr>
+            <w:shd w:val="clear" w:color="auto" w:fill="1A365D"/>
+            <w:tcW w:w="1134" w:type="dxa"/>
+          </w:tcPr>
+          <w:p>
+            <w:pPr>
+              <w:jc w:val="center"/>
+            </w:pPr>
+            <w:r>
+              <w:rPr>
+                <w:rFonts w:ascii="Calibri" w:hAnsi="Calibri"/>
+                <w:b/>
+                <w:i w:val="0"/>
+                <w:color w:val="FFFFFF"/>
+                <w:sz w:val="17"/>
+              </w:rPr>
+            </w:r>
+          </w:p>
+        </w:tc>
+        <w:tc>
+          <w:tcPr>
+            <w:shd w:val="clear" w:color="auto" w:fill="1A365D"/>
+            <w:tcW w:w="1134" w:type="dxa"/>
+          </w:tcPr>
+          <w:p>
+            <w:pPr>
+              <w:jc w:val="right"/>
+            </w:pPr>
+            <w:r>
+              <w:rPr>
+                <w:rFonts w:ascii="Calibri" w:hAnsi="Calibri"/>
+                <w:b/>
+                <w:i w:val="0"/>
+                <w:color w:val="FFFFFF"/>
+                <w:sz w:val="17"/>
+              </w:rPr>
+              <w:t>€12,405,139</w:t>
+            </w:r>
+          </w:p>
+        </w:tc>
+      </w:tr>
+      <w:tr>
+        <w:tc>
+          <w:tcPr>
+            <w:tcW w:w="2154" w:type="dxa"/>
           </w:tcPr>
           <w:p>
             <w:pPr>
@@ -1433,7 +2084,7 @@
         </w:tc>
         <w:tc>
           <w:tcPr>
-            <w:tcW w:w="963" w:type="dxa"/>
+            <w:tcW w:w="793" w:type="dxa"/>
           </w:tcPr>
           <w:p>
             <w:pPr>
@@ -1453,7 +2104,7 @@
         </w:tc>
         <w:tc>
           <w:tcPr>
-            <w:tcW w:w="737" w:type="dxa"/>
+            <w:tcW w:w="567" w:type="dxa"/>
           </w:tcPr>
           <w:p>
             <w:pPr>
@@ -1473,7 +2124,7 @@
         </w:tc>
         <w:tc>
           <w:tcPr>
-            <w:tcW w:w="737" w:type="dxa"/>
+            <w:tcW w:w="567" w:type="dxa"/>
           </w:tcPr>
           <w:p>
             <w:pPr>
@@ -1493,11 +2144,11 @@
         </w:tc>
         <w:tc>
           <w:tcPr>
-            <w:tcW w:w="567" w:type="dxa"/>
+            <w:tcW w:w="1020" w:type="dxa"/>
           </w:tcPr>
           <w:p>
             <w:pPr>
-              <w:jc w:val="right"/>
+              <w:jc w:val="center"/>
             </w:pPr>
             <w:r>
               <w:rPr>
@@ -1507,13 +2158,33 @@
                 <w:color w:val="000000"/>
                 <w:sz w:val="17"/>
               </w:rPr>
-              <w:t>20</w:t>
+              <w:t>Q2 2028</w:t>
             </w:r>
           </w:p>
         </w:tc>
         <w:tc>
           <w:tcPr>
-            <w:tcW w:w="1984" w:type="dxa"/>
+            <w:tcW w:w="1134" w:type="dxa"/>
+          </w:tcPr>
+          <w:p>
+            <w:pPr>
+              <w:jc w:val="center"/>
+            </w:pPr>
+            <w:r>
+              <w:rPr>
+                <w:rFonts w:ascii="Calibri" w:hAnsi="Calibri"/>
+                <w:b w:val="0"/>
+                <w:i w:val="0"/>
+                <w:color w:val="000000"/>
+                <w:sz w:val="17"/>
+              </w:rPr>
+              <w:t>Per EPC schedule</w:t>
+            </w:r>
+          </w:p>
+        </w:tc>
+        <w:tc>
+          <w:tcPr>
+            <w:tcW w:w="1134" w:type="dxa"/>
           </w:tcPr>
           <w:p>
             <w:pPr>
@@ -1535,8 +2206,150 @@
       <w:tr>
         <w:tc>
           <w:tcPr>
+            <w:tcW w:w="2154" w:type="dxa"/>
+          </w:tcPr>
+          <w:p>
+            <w:pPr>
+              <w:jc w:val="left"/>
+            </w:pPr>
+            <w:r>
+              <w:rPr>
+                <w:rFonts w:ascii="Calibri" w:hAnsi="Calibri"/>
+                <w:b w:val="0"/>
+                <w:i w:val="0"/>
+                <w:color w:val="000000"/>
+                <w:sz w:val="17"/>
+              </w:rPr>
+              <w:t>Esperia Green Energy (Famagusta 2)</w:t>
+            </w:r>
+          </w:p>
+        </w:tc>
+        <w:tc>
+          <w:tcPr>
+            <w:tcW w:w="793" w:type="dxa"/>
+          </w:tcPr>
+          <w:p>
+            <w:pPr>
+              <w:jc w:val="center"/>
+            </w:pPr>
+            <w:r>
+              <w:rPr>
+                <w:rFonts w:ascii="Calibri" w:hAnsi="Calibri"/>
+                <w:b w:val="0"/>
+                <w:i w:val="0"/>
+                <w:color w:val="000000"/>
+                <w:sz w:val="17"/>
+              </w:rPr>
+              <w:t>Famagusta</w:t>
+            </w:r>
+          </w:p>
+        </w:tc>
+        <w:tc>
+          <w:tcPr>
+            <w:tcW w:w="567" w:type="dxa"/>
+          </w:tcPr>
+          <w:p>
+            <w:pPr>
+              <w:jc w:val="right"/>
+            </w:pPr>
+            <w:r>
+              <w:rPr>
+                <w:rFonts w:ascii="Calibri" w:hAnsi="Calibri"/>
+                <w:b w:val="0"/>
+                <w:i w:val="0"/>
+                <w:color w:val="000000"/>
+                <w:sz w:val="17"/>
+              </w:rPr>
+              <w:t>7.00</w:t>
+            </w:r>
+          </w:p>
+        </w:tc>
+        <w:tc>
+          <w:tcPr>
+            <w:tcW w:w="567" w:type="dxa"/>
+          </w:tcPr>
+          <w:p>
+            <w:pPr>
+              <w:jc w:val="right"/>
+            </w:pPr>
+            <w:r>
+              <w:rPr>
+                <w:rFonts w:ascii="Calibri" w:hAnsi="Calibri"/>
+                <w:b w:val="0"/>
+                <w:i w:val="0"/>
+                <w:color w:val="000000"/>
+                <w:sz w:val="17"/>
+              </w:rPr>
+              <w:t>25.0</w:t>
+            </w:r>
+          </w:p>
+        </w:tc>
+        <w:tc>
+          <w:tcPr>
+            <w:tcW w:w="1020" w:type="dxa"/>
+          </w:tcPr>
+          <w:p>
+            <w:pPr>
+              <w:jc w:val="center"/>
+            </w:pPr>
+            <w:r>
+              <w:rPr>
+                <w:rFonts w:ascii="Calibri" w:hAnsi="Calibri"/>
+                <w:b w:val="0"/>
+                <w:i w:val="0"/>
+                <w:color w:val="000000"/>
+                <w:sz w:val="17"/>
+              </w:rPr>
+              <w:t>Q2 2028</w:t>
+            </w:r>
+          </w:p>
+        </w:tc>
+        <w:tc>
+          <w:tcPr>
+            <w:tcW w:w="1134" w:type="dxa"/>
+          </w:tcPr>
+          <w:p>
+            <w:pPr>
+              <w:jc w:val="center"/>
+            </w:pPr>
+            <w:r>
+              <w:rPr>
+                <w:rFonts w:ascii="Calibri" w:hAnsi="Calibri"/>
+                <w:b w:val="0"/>
+                <w:i w:val="0"/>
+                <w:color w:val="000000"/>
+                <w:sz w:val="17"/>
+              </w:rPr>
+              <w:t>Phase 2</w:t>
+            </w:r>
+          </w:p>
+        </w:tc>
+        <w:tc>
+          <w:tcPr>
+            <w:tcW w:w="1134" w:type="dxa"/>
+          </w:tcPr>
+          <w:p>
+            <w:pPr>
+              <w:jc w:val="right"/>
+            </w:pPr>
+            <w:r>
+              <w:rPr>
+                <w:rFonts w:ascii="Calibri" w:hAnsi="Calibri"/>
+                <w:b w:val="0"/>
+                <w:i w:val="0"/>
+                <w:color w:val="000000"/>
+                <w:sz w:val="17"/>
+              </w:rPr>
+              <w:t>€3,073,225*</w:t>
+            </w:r>
+          </w:p>
+        </w:tc>
+      </w:tr>
+      <w:tr>
+        <w:tc>
+          <w:tcPr>
             <w:shd w:val="clear" w:color="auto" w:fill="1A365D"/>
-            <w:tcW w:w="2948" w:type="dxa"/>
+            <w:tcW w:w="2154" w:type="dxa"/>
           </w:tcPr>
           <w:p>
             <w:pPr>
@@ -1550,14 +2363,14 @@
                 <w:color w:val="FFFFFF"/>
                 <w:sz w:val="17"/>
               </w:rPr>
-              <w:t>Phase 1 — 2026 Delivery (Esperia pipeline) — Subtotal</w:t>
+              <w:t>Batch 3 — 2028 — Subtotal</w:t>
             </w:r>
           </w:p>
         </w:tc>
         <w:tc>
           <w:tcPr>
             <w:shd w:val="clear" w:color="auto" w:fill="1A365D"/>
-            <w:tcW w:w="963" w:type="dxa"/>
+            <w:tcW w:w="793" w:type="dxa"/>
           </w:tcPr>
           <w:p>
             <w:pPr>
@@ -1571,48 +2384,6 @@
                 <w:color w:val="FFFFFF"/>
                 <w:sz w:val="17"/>
               </w:rPr>
-            </w:r>
-          </w:p>
-        </w:tc>
-        <w:tc>
-          <w:tcPr>
-            <w:shd w:val="clear" w:color="auto" w:fill="1A365D"/>
-            <w:tcW w:w="737" w:type="dxa"/>
-          </w:tcPr>
-          <w:p>
-            <w:pPr>
-              <w:jc w:val="right"/>
-            </w:pPr>
-            <w:r>
-              <w:rPr>
-                <w:rFonts w:ascii="Calibri" w:hAnsi="Calibri"/>
-                <w:b/>
-                <w:i w:val="0"/>
-                <w:color w:val="FFFFFF"/>
-                <w:sz w:val="17"/>
-              </w:rPr>
-              <w:t>39.50</w:t>
-            </w:r>
-          </w:p>
-        </w:tc>
-        <w:tc>
-          <w:tcPr>
-            <w:shd w:val="clear" w:color="auto" w:fill="1A365D"/>
-            <w:tcW w:w="737" w:type="dxa"/>
-          </w:tcPr>
-          <w:p>
-            <w:pPr>
-              <w:jc w:val="right"/>
-            </w:pPr>
-            <w:r>
-              <w:rPr>
-                <w:rFonts w:ascii="Calibri" w:hAnsi="Calibri"/>
-                <w:b/>
-                <w:i w:val="0"/>
-                <w:color w:val="FFFFFF"/>
-                <w:sz w:val="17"/>
-              </w:rPr>
-              <w:t>180.0</w:t>
             </w:r>
           </w:p>
         </w:tc>
@@ -1633,235 +2404,7 @@
                 <w:color w:val="FFFFFF"/>
                 <w:sz w:val="17"/>
               </w:rPr>
-              <w:t>36</w:t>
-            </w:r>
-          </w:p>
-        </w:tc>
-        <w:tc>
-          <w:tcPr>
-            <w:shd w:val="clear" w:color="auto" w:fill="1A365D"/>
-            <w:tcW w:w="1984" w:type="dxa"/>
-          </w:tcPr>
-          <w:p>
-            <w:pPr>
-              <w:jc w:val="right"/>
-            </w:pPr>
-            <w:r>
-              <w:rPr>
-                <w:rFonts w:ascii="Calibri" w:hAnsi="Calibri"/>
-                <w:b/>
-                <w:i w:val="0"/>
-                <w:color w:val="FFFFFF"/>
-                <w:sz w:val="17"/>
-              </w:rPr>
-              <w:t>€18,048,873</w:t>
-            </w:r>
-          </w:p>
-        </w:tc>
-      </w:tr>
-      <w:tr>
-        <w:tc>
-          <w:tcPr>
-            <w:tcW w:w="2948" w:type="dxa"/>
-          </w:tcPr>
-          <w:p>
-            <w:pPr>
-              <w:jc w:val="left"/>
-            </w:pPr>
-            <w:r>
-              <w:rPr>
-                <w:rFonts w:ascii="Calibri" w:hAnsi="Calibri"/>
-                <w:b w:val="0"/>
-                <w:i w:val="0"/>
-                <w:color w:val="000000"/>
-                <w:sz w:val="17"/>
-              </w:rPr>
-              <w:t>Esperia Green Energy (Famagusta 2)</w:t>
-            </w:r>
-          </w:p>
-        </w:tc>
-        <w:tc>
-          <w:tcPr>
-            <w:tcW w:w="963" w:type="dxa"/>
-          </w:tcPr>
-          <w:p>
-            <w:pPr>
-              <w:jc w:val="center"/>
-            </w:pPr>
-            <w:r>
-              <w:rPr>
-                <w:rFonts w:ascii="Calibri" w:hAnsi="Calibri"/>
-                <w:b w:val="0"/>
-                <w:i w:val="0"/>
-                <w:color w:val="000000"/>
-                <w:sz w:val="17"/>
-              </w:rPr>
-              <w:t>Famagusta</w:t>
-            </w:r>
-          </w:p>
-        </w:tc>
-        <w:tc>
-          <w:tcPr>
-            <w:tcW w:w="737" w:type="dxa"/>
-          </w:tcPr>
-          <w:p>
-            <w:pPr>
-              <w:jc w:val="right"/>
-            </w:pPr>
-            <w:r>
-              <w:rPr>
-                <w:rFonts w:ascii="Calibri" w:hAnsi="Calibri"/>
-                <w:b w:val="0"/>
-                <w:i w:val="0"/>
-                <w:color w:val="000000"/>
-                <w:sz w:val="17"/>
-              </w:rPr>
-              <w:t>5.00</w:t>
-            </w:r>
-          </w:p>
-        </w:tc>
-        <w:tc>
-          <w:tcPr>
-            <w:tcW w:w="737" w:type="dxa"/>
-          </w:tcPr>
-          <w:p>
-            <w:pPr>
-              <w:jc w:val="right"/>
-            </w:pPr>
-            <w:r>
-              <w:rPr>
-                <w:rFonts w:ascii="Calibri" w:hAnsi="Calibri"/>
-                <w:b w:val="0"/>
-                <w:i w:val="0"/>
-                <w:color w:val="000000"/>
-                <w:sz w:val="17"/>
-              </w:rPr>
-              <w:t>20.0</w:t>
-            </w:r>
-          </w:p>
-        </w:tc>
-        <w:tc>
-          <w:tcPr>
-            <w:tcW w:w="567" w:type="dxa"/>
-          </w:tcPr>
-          <w:p>
-            <w:pPr>
-              <w:jc w:val="right"/>
-            </w:pPr>
-            <w:r>
-              <w:rPr>
-                <w:rFonts w:ascii="Calibri" w:hAnsi="Calibri"/>
-                <w:b w:val="0"/>
-                <w:i w:val="0"/>
-                <w:color w:val="000000"/>
-                <w:sz w:val="17"/>
-              </w:rPr>
-              <w:t>4</w:t>
-            </w:r>
-          </w:p>
-        </w:tc>
-        <w:tc>
-          <w:tcPr>
-            <w:tcW w:w="1984" w:type="dxa"/>
-          </w:tcPr>
-          <w:p>
-            <w:pPr>
-              <w:jc w:val="right"/>
-            </w:pPr>
-            <w:r>
-              <w:rPr>
-                <w:rFonts w:ascii="Calibri" w:hAnsi="Calibri"/>
-                <w:b w:val="0"/>
-                <w:i w:val="0"/>
-                <w:color w:val="000000"/>
-                <w:sz w:val="17"/>
-              </w:rPr>
-              <w:t>€2,189,416</w:t>
-            </w:r>
-          </w:p>
-        </w:tc>
-      </w:tr>
-      <w:tr>
-        <w:tc>
-          <w:tcPr>
-            <w:shd w:val="clear" w:color="auto" w:fill="1A365D"/>
-            <w:tcW w:w="2948" w:type="dxa"/>
-          </w:tcPr>
-          <w:p>
-            <w:pPr>
-              <w:jc w:val="left"/>
-            </w:pPr>
-            <w:r>
-              <w:rPr>
-                <w:rFonts w:ascii="Calibri" w:hAnsi="Calibri"/>
-                <w:b/>
-                <w:i w:val="0"/>
-                <w:color w:val="FFFFFF"/>
-                <w:sz w:val="17"/>
-              </w:rPr>
-              <w:t>Phase 2 — 2027 Delivery — Subtotal</w:t>
-            </w:r>
-          </w:p>
-        </w:tc>
-        <w:tc>
-          <w:tcPr>
-            <w:shd w:val="clear" w:color="auto" w:fill="1A365D"/>
-            <w:tcW w:w="963" w:type="dxa"/>
-          </w:tcPr>
-          <w:p>
-            <w:pPr>
-              <w:jc w:val="center"/>
-            </w:pPr>
-            <w:r>
-              <w:rPr>
-                <w:rFonts w:ascii="Calibri" w:hAnsi="Calibri"/>
-                <w:b/>
-                <w:i w:val="0"/>
-                <w:color w:val="FFFFFF"/>
-                <w:sz w:val="17"/>
-              </w:rPr>
-            </w:r>
-          </w:p>
-        </w:tc>
-        <w:tc>
-          <w:tcPr>
-            <w:shd w:val="clear" w:color="auto" w:fill="1A365D"/>
-            <w:tcW w:w="737" w:type="dxa"/>
-          </w:tcPr>
-          <w:p>
-            <w:pPr>
-              <w:jc w:val="right"/>
-            </w:pPr>
-            <w:r>
-              <w:rPr>
-                <w:rFonts w:ascii="Calibri" w:hAnsi="Calibri"/>
-                <w:b/>
-                <w:i w:val="0"/>
-                <w:color w:val="FFFFFF"/>
-                <w:sz w:val="17"/>
-              </w:rPr>
-              <w:t>5.00</w:t>
-            </w:r>
-          </w:p>
-        </w:tc>
-        <w:tc>
-          <w:tcPr>
-            <w:shd w:val="clear" w:color="auto" w:fill="1A365D"/>
-            <w:tcW w:w="737" w:type="dxa"/>
-          </w:tcPr>
-          <w:p>
-            <w:pPr>
-              <w:jc w:val="right"/>
-            </w:pPr>
-            <w:r>
-              <w:rPr>
-                <w:rFonts w:ascii="Calibri" w:hAnsi="Calibri"/>
-                <w:b/>
-                <w:i w:val="0"/>
-                <w:color w:val="FFFFFF"/>
-                <w:sz w:val="17"/>
-              </w:rPr>
-              <w:t>20.0</w:t>
+              <w:t>32.00</w:t>
             </w:r>
           </w:p>
         </w:tc>
@@ -1882,668 +2425,14 @@
                 <w:color w:val="FFFFFF"/>
                 <w:sz w:val="17"/>
               </w:rPr>
-              <w:t>4</w:t>
+              <w:t>125.0</w:t>
             </w:r>
           </w:p>
         </w:tc>
         <w:tc>
           <w:tcPr>
             <w:shd w:val="clear" w:color="auto" w:fill="1A365D"/>
-            <w:tcW w:w="1984" w:type="dxa"/>
-          </w:tcPr>
-          <w:p>
-            <w:pPr>
-              <w:jc w:val="right"/>
-            </w:pPr>
-            <w:r>
-              <w:rPr>
-                <w:rFonts w:ascii="Calibri" w:hAnsi="Calibri"/>
-                <w:b/>
-                <w:i w:val="0"/>
-                <w:color w:val="FFFFFF"/>
-                <w:sz w:val="17"/>
-              </w:rPr>
-              <w:t>€2,189,416</w:t>
-            </w:r>
-          </w:p>
-        </w:tc>
-      </w:tr>
-      <w:tr>
-        <w:tc>
-          <w:tcPr>
-            <w:tcW w:w="2948" w:type="dxa"/>
-          </w:tcPr>
-          <w:p>
-            <w:pPr>
-              <w:jc w:val="left"/>
-            </w:pPr>
-            <w:r>
-              <w:rPr>
-                <w:rFonts w:ascii="Calibri" w:hAnsi="Calibri"/>
-                <w:b w:val="0"/>
-                <w:i w:val="0"/>
-                <w:color w:val="000000"/>
-                <w:sz w:val="17"/>
-              </w:rPr>
-              <w:t>Esperia Energy (Tseri)</w:t>
-            </w:r>
-          </w:p>
-        </w:tc>
-        <w:tc>
-          <w:tcPr>
-            <w:tcW w:w="963" w:type="dxa"/>
-          </w:tcPr>
-          <w:p>
-            <w:pPr>
-              <w:jc w:val="center"/>
-            </w:pPr>
-            <w:r>
-              <w:rPr>
-                <w:rFonts w:ascii="Calibri" w:hAnsi="Calibri"/>
-                <w:b w:val="0"/>
-                <w:i w:val="0"/>
-                <w:color w:val="000000"/>
-                <w:sz w:val="17"/>
-              </w:rPr>
-              <w:t>Nicosia</w:t>
-            </w:r>
-          </w:p>
-        </w:tc>
-        <w:tc>
-          <w:tcPr>
-            <w:tcW w:w="737" w:type="dxa"/>
-          </w:tcPr>
-          <w:p>
-            <w:pPr>
-              <w:jc w:val="right"/>
-            </w:pPr>
-            <w:r>
-              <w:rPr>
-                <w:rFonts w:ascii="Calibri" w:hAnsi="Calibri"/>
-                <w:b w:val="0"/>
-                <w:i w:val="0"/>
-                <w:color w:val="000000"/>
-                <w:sz w:val="17"/>
-              </w:rPr>
-              <w:t>7.00</w:t>
-            </w:r>
-          </w:p>
-        </w:tc>
-        <w:tc>
-          <w:tcPr>
-            <w:tcW w:w="737" w:type="dxa"/>
-          </w:tcPr>
-          <w:p>
-            <w:pPr>
-              <w:jc w:val="right"/>
-            </w:pPr>
-            <w:r>
-              <w:rPr>
-                <w:rFonts w:ascii="Calibri" w:hAnsi="Calibri"/>
-                <w:b w:val="0"/>
-                <w:i w:val="0"/>
-                <w:color w:val="000000"/>
-                <w:sz w:val="17"/>
-              </w:rPr>
-              <w:t>20.0</w:t>
-            </w:r>
-          </w:p>
-        </w:tc>
-        <w:tc>
-          <w:tcPr>
-            <w:tcW w:w="567" w:type="dxa"/>
-          </w:tcPr>
-          <w:p>
-            <w:pPr>
-              <w:jc w:val="right"/>
-            </w:pPr>
-            <w:r>
-              <w:rPr>
-                <w:rFonts w:ascii="Calibri" w:hAnsi="Calibri"/>
-                <w:b w:val="0"/>
-                <w:i w:val="0"/>
-                <w:color w:val="000000"/>
-                <w:sz w:val="17"/>
-              </w:rPr>
-              <w:t>4</w:t>
-            </w:r>
-          </w:p>
-        </w:tc>
-        <w:tc>
-          <w:tcPr>
-            <w:tcW w:w="1984" w:type="dxa"/>
-          </w:tcPr>
-          <w:p>
-            <w:pPr>
-              <w:jc w:val="right"/>
-            </w:pPr>
-            <w:r>
-              <w:rPr>
-                <w:rFonts w:ascii="Calibri" w:hAnsi="Calibri"/>
-                <w:b w:val="0"/>
-                <w:i w:val="0"/>
-                <w:color w:val="000000"/>
-                <w:sz w:val="17"/>
-              </w:rPr>
-              <w:t>€2,382,035</w:t>
-            </w:r>
-          </w:p>
-        </w:tc>
-      </w:tr>
-      <w:tr>
-        <w:tc>
-          <w:tcPr>
-            <w:tcW w:w="2948" w:type="dxa"/>
-          </w:tcPr>
-          <w:p>
-            <w:pPr>
-              <w:jc w:val="left"/>
-            </w:pPr>
-            <w:r>
-              <w:rPr>
-                <w:rFonts w:ascii="Calibri" w:hAnsi="Calibri"/>
-                <w:b w:val="0"/>
-                <w:i w:val="0"/>
-                <w:color w:val="000000"/>
-                <w:sz w:val="17"/>
-              </w:rPr>
-              <w:t>Esperia Energy (Tseri 2-A)</w:t>
-            </w:r>
-          </w:p>
-        </w:tc>
-        <w:tc>
-          <w:tcPr>
-            <w:tcW w:w="963" w:type="dxa"/>
-          </w:tcPr>
-          <w:p>
-            <w:pPr>
-              <w:jc w:val="center"/>
-            </w:pPr>
-            <w:r>
-              <w:rPr>
-                <w:rFonts w:ascii="Calibri" w:hAnsi="Calibri"/>
-                <w:b w:val="0"/>
-                <w:i w:val="0"/>
-                <w:color w:val="000000"/>
-                <w:sz w:val="17"/>
-              </w:rPr>
-              <w:t>Nicosia</w:t>
-            </w:r>
-          </w:p>
-        </w:tc>
-        <w:tc>
-          <w:tcPr>
-            <w:tcW w:w="737" w:type="dxa"/>
-          </w:tcPr>
-          <w:p>
-            <w:pPr>
-              <w:jc w:val="right"/>
-            </w:pPr>
-            <w:r>
-              <w:rPr>
-                <w:rFonts w:ascii="Calibri" w:hAnsi="Calibri"/>
-                <w:b w:val="0"/>
-                <w:i w:val="0"/>
-                <w:color w:val="000000"/>
-                <w:sz w:val="17"/>
-              </w:rPr>
-              <w:t>2.50</w:t>
-            </w:r>
-          </w:p>
-        </w:tc>
-        <w:tc>
-          <w:tcPr>
-            <w:tcW w:w="737" w:type="dxa"/>
-          </w:tcPr>
-          <w:p>
-            <w:pPr>
-              <w:jc w:val="right"/>
-            </w:pPr>
-            <w:r>
-              <w:rPr>
-                <w:rFonts w:ascii="Calibri" w:hAnsi="Calibri"/>
-                <w:b w:val="0"/>
-                <w:i w:val="0"/>
-                <w:color w:val="000000"/>
-                <w:sz w:val="17"/>
-              </w:rPr>
-              <w:t>7.5</w:t>
-            </w:r>
-          </w:p>
-        </w:tc>
-        <w:tc>
-          <w:tcPr>
-            <w:tcW w:w="567" w:type="dxa"/>
-          </w:tcPr>
-          <w:p>
-            <w:pPr>
-              <w:jc w:val="right"/>
-            </w:pPr>
-            <w:r>
-              <w:rPr>
-                <w:rFonts w:ascii="Calibri" w:hAnsi="Calibri"/>
-                <w:b w:val="0"/>
-                <w:i w:val="0"/>
-                <w:color w:val="000000"/>
-                <w:sz w:val="17"/>
-              </w:rPr>
-              <w:t>2</w:t>
-            </w:r>
-          </w:p>
-        </w:tc>
-        <w:tc>
-          <w:tcPr>
-            <w:tcW w:w="1984" w:type="dxa"/>
-          </w:tcPr>
-          <w:p>
-            <w:pPr>
-              <w:jc w:val="right"/>
-            </w:pPr>
-            <w:r>
-              <w:rPr>
-                <w:rFonts w:ascii="Calibri" w:hAnsi="Calibri"/>
-                <w:b w:val="0"/>
-                <w:i w:val="0"/>
-                <w:color w:val="000000"/>
-                <w:sz w:val="17"/>
-              </w:rPr>
-              <w:t>€1,084,620</w:t>
-            </w:r>
-          </w:p>
-        </w:tc>
-      </w:tr>
-      <w:tr>
-        <w:tc>
-          <w:tcPr>
-            <w:tcW w:w="2948" w:type="dxa"/>
-          </w:tcPr>
-          <w:p>
-            <w:pPr>
-              <w:jc w:val="left"/>
-            </w:pPr>
-            <w:r>
-              <w:rPr>
-                <w:rFonts w:ascii="Calibri" w:hAnsi="Calibri"/>
-                <w:b w:val="0"/>
-                <w:i w:val="0"/>
-                <w:color w:val="000000"/>
-                <w:sz w:val="17"/>
-              </w:rPr>
-              <w:t>Esperia Energy (Tseri 2-B)</w:t>
-            </w:r>
-          </w:p>
-        </w:tc>
-        <w:tc>
-          <w:tcPr>
-            <w:tcW w:w="963" w:type="dxa"/>
-          </w:tcPr>
-          <w:p>
-            <w:pPr>
-              <w:jc w:val="center"/>
-            </w:pPr>
-            <w:r>
-              <w:rPr>
-                <w:rFonts w:ascii="Calibri" w:hAnsi="Calibri"/>
-                <w:b w:val="0"/>
-                <w:i w:val="0"/>
-                <w:color w:val="000000"/>
-                <w:sz w:val="17"/>
-              </w:rPr>
-              <w:t>Nicosia</w:t>
-            </w:r>
-          </w:p>
-        </w:tc>
-        <w:tc>
-          <w:tcPr>
-            <w:tcW w:w="737" w:type="dxa"/>
-          </w:tcPr>
-          <w:p>
-            <w:pPr>
-              <w:jc w:val="right"/>
-            </w:pPr>
-            <w:r>
-              <w:rPr>
-                <w:rFonts w:ascii="Calibri" w:hAnsi="Calibri"/>
-                <w:b w:val="0"/>
-                <w:i w:val="0"/>
-                <w:color w:val="000000"/>
-                <w:sz w:val="17"/>
-              </w:rPr>
-              <w:t>7.50</w:t>
-            </w:r>
-          </w:p>
-        </w:tc>
-        <w:tc>
-          <w:tcPr>
-            <w:tcW w:w="737" w:type="dxa"/>
-          </w:tcPr>
-          <w:p>
-            <w:pPr>
-              <w:jc w:val="right"/>
-            </w:pPr>
-            <w:r>
-              <w:rPr>
-                <w:rFonts w:ascii="Calibri" w:hAnsi="Calibri"/>
-                <w:b w:val="0"/>
-                <w:i w:val="0"/>
-                <w:color w:val="000000"/>
-                <w:sz w:val="17"/>
-              </w:rPr>
-              <w:t>25.0</w:t>
-            </w:r>
-          </w:p>
-        </w:tc>
-        <w:tc>
-          <w:tcPr>
-            <w:tcW w:w="567" w:type="dxa"/>
-          </w:tcPr>
-          <w:p>
-            <w:pPr>
-              <w:jc w:val="right"/>
-            </w:pPr>
-            <w:r>
-              <w:rPr>
-                <w:rFonts w:ascii="Calibri" w:hAnsi="Calibri"/>
-                <w:b w:val="0"/>
-                <w:i w:val="0"/>
-                <w:color w:val="000000"/>
-                <w:sz w:val="17"/>
-              </w:rPr>
-              <w:t>5</w:t>
-            </w:r>
-          </w:p>
-        </w:tc>
-        <w:tc>
-          <w:tcPr>
-            <w:tcW w:w="1984" w:type="dxa"/>
-          </w:tcPr>
-          <w:p>
-            <w:pPr>
-              <w:jc w:val="right"/>
-            </w:pPr>
-            <w:r>
-              <w:rPr>
-                <w:rFonts w:ascii="Calibri" w:hAnsi="Calibri"/>
-                <w:b w:val="0"/>
-                <w:i w:val="0"/>
-                <w:color w:val="000000"/>
-                <w:sz w:val="17"/>
-              </w:rPr>
-              <w:t>€2,912,993</w:t>
-            </w:r>
-          </w:p>
-        </w:tc>
-      </w:tr>
-      <w:tr>
-        <w:tc>
-          <w:tcPr>
-            <w:tcW w:w="2948" w:type="dxa"/>
-          </w:tcPr>
-          <w:p>
-            <w:pPr>
-              <w:jc w:val="left"/>
-            </w:pPr>
-            <w:r>
-              <w:rPr>
-                <w:rFonts w:ascii="Calibri" w:hAnsi="Calibri"/>
-                <w:b w:val="0"/>
-                <w:i w:val="0"/>
-                <w:color w:val="000000"/>
-                <w:sz w:val="17"/>
-              </w:rPr>
-              <w:t>Esperia Energy (Tseri 2-C)</w:t>
-            </w:r>
-          </w:p>
-        </w:tc>
-        <w:tc>
-          <w:tcPr>
-            <w:tcW w:w="963" w:type="dxa"/>
-          </w:tcPr>
-          <w:p>
-            <w:pPr>
-              <w:jc w:val="center"/>
-            </w:pPr>
-            <w:r>
-              <w:rPr>
-                <w:rFonts w:ascii="Calibri" w:hAnsi="Calibri"/>
-                <w:b w:val="0"/>
-                <w:i w:val="0"/>
-                <w:color w:val="000000"/>
-                <w:sz w:val="17"/>
-              </w:rPr>
-              <w:t>Nicosia</w:t>
-            </w:r>
-          </w:p>
-        </w:tc>
-        <w:tc>
-          <w:tcPr>
-            <w:tcW w:w="737" w:type="dxa"/>
-          </w:tcPr>
-          <w:p>
-            <w:pPr>
-              <w:jc w:val="right"/>
-            </w:pPr>
-            <w:r>
-              <w:rPr>
-                <w:rFonts w:ascii="Calibri" w:hAnsi="Calibri"/>
-                <w:b w:val="0"/>
-                <w:i w:val="0"/>
-                <w:color w:val="000000"/>
-                <w:sz w:val="17"/>
-              </w:rPr>
-              <w:t>6.00</w:t>
-            </w:r>
-          </w:p>
-        </w:tc>
-        <w:tc>
-          <w:tcPr>
-            <w:tcW w:w="737" w:type="dxa"/>
-          </w:tcPr>
-          <w:p>
-            <w:pPr>
-              <w:jc w:val="right"/>
-            </w:pPr>
-            <w:r>
-              <w:rPr>
-                <w:rFonts w:ascii="Calibri" w:hAnsi="Calibri"/>
-                <w:b w:val="0"/>
-                <w:i w:val="0"/>
-                <w:color w:val="000000"/>
-                <w:sz w:val="17"/>
-              </w:rPr>
-              <w:t>20.0</w:t>
-            </w:r>
-          </w:p>
-        </w:tc>
-        <w:tc>
-          <w:tcPr>
-            <w:tcW w:w="567" w:type="dxa"/>
-          </w:tcPr>
-          <w:p>
-            <w:pPr>
-              <w:jc w:val="right"/>
-            </w:pPr>
-            <w:r>
-              <w:rPr>
-                <w:rFonts w:ascii="Calibri" w:hAnsi="Calibri"/>
-                <w:b w:val="0"/>
-                <w:i w:val="0"/>
-                <w:color w:val="000000"/>
-                <w:sz w:val="17"/>
-              </w:rPr>
-              <w:t>4</w:t>
-            </w:r>
-          </w:p>
-        </w:tc>
-        <w:tc>
-          <w:tcPr>
-            <w:tcW w:w="1984" w:type="dxa"/>
-          </w:tcPr>
-          <w:p>
-            <w:pPr>
-              <w:jc w:val="right"/>
-            </w:pPr>
-            <w:r>
-              <w:rPr>
-                <w:rFonts w:ascii="Calibri" w:hAnsi="Calibri"/>
-                <w:b w:val="0"/>
-                <w:i w:val="0"/>
-                <w:color w:val="000000"/>
-                <w:sz w:val="17"/>
-              </w:rPr>
-              <w:t>€1,551,848</w:t>
-            </w:r>
-          </w:p>
-        </w:tc>
-      </w:tr>
-      <w:tr>
-        <w:tc>
-          <w:tcPr>
-            <w:tcW w:w="2948" w:type="dxa"/>
-          </w:tcPr>
-          <w:p>
-            <w:pPr>
-              <w:jc w:val="left"/>
-            </w:pPr>
-            <w:r>
-              <w:rPr>
-                <w:rFonts w:ascii="Calibri" w:hAnsi="Calibri"/>
-                <w:b w:val="0"/>
-                <w:i w:val="0"/>
-                <w:color w:val="000000"/>
-                <w:sz w:val="17"/>
-              </w:rPr>
-              <w:t>Esperia Energy (Tseri 3)</w:t>
-            </w:r>
-          </w:p>
-        </w:tc>
-        <w:tc>
-          <w:tcPr>
-            <w:tcW w:w="963" w:type="dxa"/>
-          </w:tcPr>
-          <w:p>
-            <w:pPr>
-              <w:jc w:val="center"/>
-            </w:pPr>
-            <w:r>
-              <w:rPr>
-                <w:rFonts w:ascii="Calibri" w:hAnsi="Calibri"/>
-                <w:b w:val="0"/>
-                <w:i w:val="0"/>
-                <w:color w:val="000000"/>
-                <w:sz w:val="17"/>
-              </w:rPr>
-              <w:t>Nicosia</w:t>
-            </w:r>
-          </w:p>
-        </w:tc>
-        <w:tc>
-          <w:tcPr>
-            <w:tcW w:w="737" w:type="dxa"/>
-          </w:tcPr>
-          <w:p>
-            <w:pPr>
-              <w:jc w:val="right"/>
-            </w:pPr>
-            <w:r>
-              <w:rPr>
-                <w:rFonts w:ascii="Calibri" w:hAnsi="Calibri"/>
-                <w:b w:val="0"/>
-                <w:i w:val="0"/>
-                <w:color w:val="000000"/>
-                <w:sz w:val="17"/>
-              </w:rPr>
-              <w:t>4.75</w:t>
-            </w:r>
-          </w:p>
-        </w:tc>
-        <w:tc>
-          <w:tcPr>
-            <w:tcW w:w="737" w:type="dxa"/>
-          </w:tcPr>
-          <w:p>
-            <w:pPr>
-              <w:jc w:val="right"/>
-            </w:pPr>
-            <w:r>
-              <w:rPr>
-                <w:rFonts w:ascii="Calibri" w:hAnsi="Calibri"/>
-                <w:b w:val="0"/>
-                <w:i w:val="0"/>
-                <w:color w:val="000000"/>
-                <w:sz w:val="17"/>
-              </w:rPr>
-              <w:t>15.0</w:t>
-            </w:r>
-          </w:p>
-        </w:tc>
-        <w:tc>
-          <w:tcPr>
-            <w:tcW w:w="567" w:type="dxa"/>
-          </w:tcPr>
-          <w:p>
-            <w:pPr>
-              <w:jc w:val="right"/>
-            </w:pPr>
-            <w:r>
-              <w:rPr>
-                <w:rFonts w:ascii="Calibri" w:hAnsi="Calibri"/>
-                <w:b w:val="0"/>
-                <w:i w:val="0"/>
-                <w:color w:val="000000"/>
-                <w:sz w:val="17"/>
-              </w:rPr>
-              <w:t>3</w:t>
-            </w:r>
-          </w:p>
-        </w:tc>
-        <w:tc>
-          <w:tcPr>
-            <w:tcW w:w="1984" w:type="dxa"/>
-          </w:tcPr>
-          <w:p>
-            <w:pPr>
-              <w:jc w:val="right"/>
-            </w:pPr>
-            <w:r>
-              <w:rPr>
-                <w:rFonts w:ascii="Calibri" w:hAnsi="Calibri"/>
-                <w:b w:val="0"/>
-                <w:i w:val="0"/>
-                <w:color w:val="000000"/>
-                <w:sz w:val="17"/>
-              </w:rPr>
-              <w:t>€1,874,143</w:t>
-            </w:r>
-          </w:p>
-        </w:tc>
-      </w:tr>
-      <w:tr>
-        <w:tc>
-          <w:tcPr>
-            <w:shd w:val="clear" w:color="auto" w:fill="1A365D"/>
-            <w:tcW w:w="2948" w:type="dxa"/>
-          </w:tcPr>
-          <w:p>
-            <w:pPr>
-              <w:jc w:val="left"/>
-            </w:pPr>
-            <w:r>
-              <w:rPr>
-                <w:rFonts w:ascii="Calibri" w:hAnsi="Calibri"/>
-                <w:b/>
-                <w:i w:val="0"/>
-                <w:color w:val="FFFFFF"/>
-                <w:sz w:val="17"/>
-              </w:rPr>
-              <w:t>Phase 3 — 2028 Delivery (Tseri Portfolio) — Subtotal</w:t>
-            </w:r>
-          </w:p>
-        </w:tc>
-        <w:tc>
-          <w:tcPr>
-            <w:shd w:val="clear" w:color="auto" w:fill="1A365D"/>
-            <w:tcW w:w="963" w:type="dxa"/>
+            <w:tcW w:w="1020" w:type="dxa"/>
           </w:tcPr>
           <w:p>
             <w:pPr>
@@ -2563,7 +2452,27 @@
         <w:tc>
           <w:tcPr>
             <w:shd w:val="clear" w:color="auto" w:fill="1A365D"/>
-            <w:tcW w:w="737" w:type="dxa"/>
+            <w:tcW w:w="1134" w:type="dxa"/>
+          </w:tcPr>
+          <w:p>
+            <w:pPr>
+              <w:jc w:val="center"/>
+            </w:pPr>
+            <w:r>
+              <w:rPr>
+                <w:rFonts w:ascii="Calibri" w:hAnsi="Calibri"/>
+                <w:b/>
+                <w:i w:val="0"/>
+                <w:color w:val="FFFFFF"/>
+                <w:sz w:val="17"/>
+              </w:rPr>
+            </w:r>
+          </w:p>
+        </w:tc>
+        <w:tc>
+          <w:tcPr>
+            <w:shd w:val="clear" w:color="auto" w:fill="1A365D"/>
+            <w:tcW w:w="1134" w:type="dxa"/>
           </w:tcPr>
           <w:p>
             <w:pPr>
@@ -2577,18 +2486,20 @@
                 <w:color w:val="FFFFFF"/>
                 <w:sz w:val="17"/>
               </w:rPr>
-              <w:t>27.75</w:t>
+              <w:t>€13,161,239</w:t>
             </w:r>
           </w:p>
         </w:tc>
+      </w:tr>
+      <w:tr>
         <w:tc>
           <w:tcPr>
             <w:shd w:val="clear" w:color="auto" w:fill="1A365D"/>
-            <w:tcW w:w="737" w:type="dxa"/>
+            <w:tcW w:w="2154" w:type="dxa"/>
           </w:tcPr>
           <w:p>
             <w:pPr>
-              <w:jc w:val="right"/>
+              <w:jc w:val="left"/>
             </w:pPr>
             <w:r>
               <w:rPr>
@@ -2598,7 +2509,27 @@
                 <w:color w:val="FFFFFF"/>
                 <w:sz w:val="17"/>
               </w:rPr>
-              <w:t>87.5</w:t>
+              <w:t>TOTAL SCHEDULE 1  (9 pipeline parks)</w:t>
+            </w:r>
+          </w:p>
+        </w:tc>
+        <w:tc>
+          <w:tcPr>
+            <w:shd w:val="clear" w:color="auto" w:fill="1A365D"/>
+            <w:tcW w:w="793" w:type="dxa"/>
+          </w:tcPr>
+          <w:p>
+            <w:pPr>
+              <w:jc w:val="center"/>
+            </w:pPr>
+            <w:r>
+              <w:rPr>
+                <w:rFonts w:ascii="Calibri" w:hAnsi="Calibri"/>
+                <w:b/>
+                <w:i w:val="0"/>
+                <w:color w:val="FFFFFF"/>
+                <w:sz w:val="17"/>
+              </w:rPr>
             </w:r>
           </w:p>
         </w:tc>
@@ -2619,113 +2550,7 @@
                 <w:color w:val="FFFFFF"/>
                 <w:sz w:val="17"/>
               </w:rPr>
-              <w:t>18</w:t>
-            </w:r>
-          </w:p>
-        </w:tc>
-        <w:tc>
-          <w:tcPr>
-            <w:shd w:val="clear" w:color="auto" w:fill="1A365D"/>
-            <w:tcW w:w="1984" w:type="dxa"/>
-          </w:tcPr>
-          <w:p>
-            <w:pPr>
-              <w:jc w:val="right"/>
-            </w:pPr>
-            <w:r>
-              <w:rPr>
-                <w:rFonts w:ascii="Calibri" w:hAnsi="Calibri"/>
-                <w:b/>
-                <w:i w:val="0"/>
-                <w:color w:val="FFFFFF"/>
-                <w:sz w:val="17"/>
-              </w:rPr>
-              <w:t>€9,805,639</w:t>
-            </w:r>
-          </w:p>
-        </w:tc>
-      </w:tr>
-      <w:tr>
-        <w:tc>
-          <w:tcPr>
-            <w:shd w:val="clear" w:color="auto" w:fill="1A365D"/>
-            <w:tcW w:w="2948" w:type="dxa"/>
-          </w:tcPr>
-          <w:p>
-            <w:pPr>
-              <w:jc w:val="left"/>
-            </w:pPr>
-            <w:r>
-              <w:rPr>
-                <w:rFonts w:ascii="Calibri" w:hAnsi="Calibri"/>
-                <w:b/>
-                <w:i w:val="0"/>
-                <w:color w:val="FFFFFF"/>
-                <w:sz w:val="17"/>
-              </w:rPr>
-              <w:t>TOTAL SCHEDULE 1  (11 parks: 2 Galascope + 9 pipeline)</w:t>
-            </w:r>
-          </w:p>
-        </w:tc>
-        <w:tc>
-          <w:tcPr>
-            <w:shd w:val="clear" w:color="auto" w:fill="1A365D"/>
-            <w:tcW w:w="963" w:type="dxa"/>
-          </w:tcPr>
-          <w:p>
-            <w:pPr>
-              <w:jc w:val="center"/>
-            </w:pPr>
-            <w:r>
-              <w:rPr>
-                <w:rFonts w:ascii="Calibri" w:hAnsi="Calibri"/>
-                <w:b/>
-                <w:i w:val="0"/>
-                <w:color w:val="FFFFFF"/>
-                <w:sz w:val="17"/>
-              </w:rPr>
-            </w:r>
-          </w:p>
-        </w:tc>
-        <w:tc>
-          <w:tcPr>
-            <w:shd w:val="clear" w:color="auto" w:fill="1A365D"/>
-            <w:tcW w:w="737" w:type="dxa"/>
-          </w:tcPr>
-          <w:p>
-            <w:pPr>
-              <w:jc w:val="right"/>
-            </w:pPr>
-            <w:r>
-              <w:rPr>
-                <w:rFonts w:ascii="Calibri" w:hAnsi="Calibri"/>
-                <w:b/>
-                <w:i w:val="0"/>
-                <w:color w:val="FFFFFF"/>
-                <w:sz w:val="17"/>
-              </w:rPr>
-              <w:t>79.75</w:t>
-            </w:r>
-          </w:p>
-        </w:tc>
-        <w:tc>
-          <w:tcPr>
-            <w:shd w:val="clear" w:color="auto" w:fill="1A365D"/>
-            <w:tcW w:w="737" w:type="dxa"/>
-          </w:tcPr>
-          <w:p>
-            <w:pPr>
-              <w:jc w:val="right"/>
-            </w:pPr>
-            <w:r>
-              <w:rPr>
-                <w:rFonts w:ascii="Calibri" w:hAnsi="Calibri"/>
-                <w:b/>
-                <w:i w:val="0"/>
-                <w:color w:val="FFFFFF"/>
-                <w:sz w:val="17"/>
-              </w:rPr>
-              <w:t>317.5</w:t>
+              <w:t>75.49</w:t>
             </w:r>
           </w:p>
         </w:tc>
@@ -2746,14 +2571,54 @@
                 <w:color w:val="FFFFFF"/>
                 <w:sz w:val="17"/>
               </w:rPr>
-              <w:t>66</w:t>
+              <w:t>315.0</w:t>
             </w:r>
           </w:p>
         </w:tc>
         <w:tc>
           <w:tcPr>
             <w:shd w:val="clear" w:color="auto" w:fill="1A365D"/>
-            <w:tcW w:w="1984" w:type="dxa"/>
+            <w:tcW w:w="1020" w:type="dxa"/>
+          </w:tcPr>
+          <w:p>
+            <w:pPr>
+              <w:jc w:val="center"/>
+            </w:pPr>
+            <w:r>
+              <w:rPr>
+                <w:rFonts w:ascii="Calibri" w:hAnsi="Calibri"/>
+                <w:b/>
+                <w:i w:val="0"/>
+                <w:color w:val="FFFFFF"/>
+                <w:sz w:val="17"/>
+              </w:rPr>
+            </w:r>
+          </w:p>
+        </w:tc>
+        <w:tc>
+          <w:tcPr>
+            <w:shd w:val="clear" w:color="auto" w:fill="1A365D"/>
+            <w:tcW w:w="1134" w:type="dxa"/>
+          </w:tcPr>
+          <w:p>
+            <w:pPr>
+              <w:jc w:val="center"/>
+            </w:pPr>
+            <w:r>
+              <w:rPr>
+                <w:rFonts w:ascii="Calibri" w:hAnsi="Calibri"/>
+                <w:b/>
+                <w:i w:val="0"/>
+                <w:color w:val="FFFFFF"/>
+                <w:sz w:val="17"/>
+              </w:rPr>
+            </w:r>
+          </w:p>
+        </w:tc>
+        <w:tc>
+          <w:tcPr>
+            <w:shd w:val="clear" w:color="auto" w:fill="1A365D"/>
+            <w:tcW w:w="1134" w:type="dxa"/>
           </w:tcPr>
           <w:p>
             <w:pPr>
@@ -2767,12 +2632,28 @@
                 <w:color w:val="FFFFFF"/>
                 <w:sz w:val="17"/>
               </w:rPr>
-              <w:t>€33,488,228</w:t>
+              <w:t>€34,458,823</w:t>
             </w:r>
           </w:p>
         </w:tc>
       </w:tr>
     </w:tbl>
+    <w:p>
+      <w:pPr>
+        <w:spacing w:after="80"/>
+        <w:jc w:val="both"/>
+      </w:pPr>
+      <w:r>
+        <w:rPr>
+          <w:rFonts w:ascii="Calibri" w:hAnsi="Calibri"/>
+          <w:b w:val="0"/>
+          <w:i w:val="0"/>
+          <w:color w:val="404040"/>
+          <w:sz w:val="18"/>
+        </w:rPr>
+        <w:t>* Indicative Prices marked * use the nearest Linyang configuration (LY202601271) where MW/MWh is not an exact quoted line: Tseri, Tseri 2-A, Tseri 3, Famagusta, Tseri 2-B, Tseri 2-C, Famagusta 2. Limassol and Frenaros are exact LY lines.</w:t>
+      </w:r>
+    </w:p>
     <w:p>
       <w:pPr>
         <w:spacing w:before="320" w:after="80"/>
@@ -2788,25 +2669,8 @@
         <w:t>3.   INDICATIVE PROGRAMME</w:t>
       </w:r>
     </w:p>
-    <w:p>
-      <w:pPr>
-        <w:spacing w:after="100"/>
-        <w:jc w:val="both"/>
-      </w:pPr>
-      <w:r>
-        <w:rPr>
-          <w:rFonts w:ascii="Calibri" w:hAnsi="Calibri"/>
-          <w:b w:val="0"/>
-          <w:i w:val="0"/>
-          <w:color w:val="000000"/>
-          <w:sz w:val="20"/>
-        </w:rPr>
-        <w:t>Target dates are indicative; each EPC sets binding milestones. Pipeline phases generally require EAC/DSO grid connection and satisfactory PAC of the prior phase.</w:t>
-      </w:r>
-    </w:p>
     <w:tbl>
       <w:tblPr>
-        <w:jc w:val="left"/>
         <w:tblLook w:firstColumn="1" w:firstRow="1" w:lastColumn="0" w:lastRow="0" w:noHBand="0" w:noVBand="1" w:val="04A0"/>
         <w:tblW w:w="7370" w:type="dxa"/>
         <w:tblLayout w:type="fixed"/>
@@ -2947,7 +2811,211 @@
                 <w:color w:val="000000"/>
                 <w:sz w:val="17"/>
               </w:rPr>
-              <w:t>Galascope Ltd — LCY-EPC-GAL-B1-2026</w:t>
+              <w:t>Batch 1 — 2026</w:t>
+            </w:r>
+          </w:p>
+        </w:tc>
+        <w:tc>
+          <w:tcPr>
+            <w:tcW w:w="567" w:type="dxa"/>
+          </w:tcPr>
+          <w:p>
+            <w:pPr>
+              <w:jc w:val="center"/>
+            </w:pPr>
+            <w:r>
+              <w:rPr>
+                <w:rFonts w:ascii="Calibri" w:hAnsi="Calibri"/>
+                <w:b w:val="0"/>
+                <w:i w:val="0"/>
+                <w:color w:val="000000"/>
+                <w:sz w:val="17"/>
+              </w:rPr>
+              <w:t>4</w:t>
+            </w:r>
+          </w:p>
+        </w:tc>
+        <w:tc>
+          <w:tcPr>
+            <w:tcW w:w="680" w:type="dxa"/>
+          </w:tcPr>
+          <w:p>
+            <w:pPr>
+              <w:jc w:val="right"/>
+            </w:pPr>
+            <w:r>
+              <w:rPr>
+                <w:rFonts w:ascii="Calibri" w:hAnsi="Calibri"/>
+                <w:b w:val="0"/>
+                <w:i w:val="0"/>
+                <w:color w:val="000000"/>
+                <w:sz w:val="17"/>
+              </w:rPr>
+              <w:t>75.0</w:t>
+            </w:r>
+          </w:p>
+        </w:tc>
+        <w:tc>
+          <w:tcPr>
+            <w:tcW w:w="1134" w:type="dxa"/>
+          </w:tcPr>
+          <w:p>
+            <w:pPr>
+              <w:jc w:val="right"/>
+            </w:pPr>
+            <w:r>
+              <w:rPr>
+                <w:rFonts w:ascii="Calibri" w:hAnsi="Calibri"/>
+                <w:b w:val="0"/>
+                <w:i w:val="0"/>
+                <w:color w:val="000000"/>
+                <w:sz w:val="17"/>
+              </w:rPr>
+              <w:t>2026 (per park)</w:t>
+            </w:r>
+          </w:p>
+        </w:tc>
+        <w:tc>
+          <w:tcPr>
+            <w:tcW w:w="1871" w:type="dxa"/>
+          </w:tcPr>
+          <w:p>
+            <w:pPr>
+              <w:jc w:val="right"/>
+            </w:pPr>
+            <w:r>
+              <w:rPr>
+                <w:rFonts w:ascii="Calibri" w:hAnsi="Calibri"/>
+                <w:b w:val="0"/>
+                <w:i w:val="0"/>
+                <w:color w:val="000000"/>
+                <w:sz w:val="17"/>
+              </w:rPr>
+              <w:t>€8,892,445</w:t>
+            </w:r>
+          </w:p>
+        </w:tc>
+      </w:tr>
+      <w:tr>
+        <w:tc>
+          <w:tcPr>
+            <w:tcW w:w="3118" w:type="dxa"/>
+          </w:tcPr>
+          <w:p>
+            <w:pPr>
+              <w:jc w:val="left"/>
+            </w:pPr>
+            <w:r>
+              <w:rPr>
+                <w:rFonts w:ascii="Calibri" w:hAnsi="Calibri"/>
+                <w:b w:val="0"/>
+                <w:i w:val="0"/>
+                <w:color w:val="000000"/>
+                <w:sz w:val="17"/>
+              </w:rPr>
+              <w:t>Batch 2 — 2027</w:t>
+            </w:r>
+          </w:p>
+        </w:tc>
+        <w:tc>
+          <w:tcPr>
+            <w:tcW w:w="567" w:type="dxa"/>
+          </w:tcPr>
+          <w:p>
+            <w:pPr>
+              <w:jc w:val="center"/>
+            </w:pPr>
+            <w:r>
+              <w:rPr>
+                <w:rFonts w:ascii="Calibri" w:hAnsi="Calibri"/>
+                <w:b w:val="0"/>
+                <w:i w:val="0"/>
+                <w:color w:val="000000"/>
+                <w:sz w:val="17"/>
+              </w:rPr>
+              <w:t>3</w:t>
+            </w:r>
+          </w:p>
+        </w:tc>
+        <w:tc>
+          <w:tcPr>
+            <w:tcW w:w="680" w:type="dxa"/>
+          </w:tcPr>
+          <w:p>
+            <w:pPr>
+              <w:jc w:val="right"/>
+            </w:pPr>
+            <w:r>
+              <w:rPr>
+                <w:rFonts w:ascii="Calibri" w:hAnsi="Calibri"/>
+                <w:b w:val="0"/>
+                <w:i w:val="0"/>
+                <w:color w:val="000000"/>
+                <w:sz w:val="17"/>
+              </w:rPr>
+              <w:t>115.0</w:t>
+            </w:r>
+          </w:p>
+        </w:tc>
+        <w:tc>
+          <w:tcPr>
+            <w:tcW w:w="1134" w:type="dxa"/>
+          </w:tcPr>
+          <w:p>
+            <w:pPr>
+              <w:jc w:val="right"/>
+            </w:pPr>
+            <w:r>
+              <w:rPr>
+                <w:rFonts w:ascii="Calibri" w:hAnsi="Calibri"/>
+                <w:b w:val="0"/>
+                <w:i w:val="0"/>
+                <w:color w:val="000000"/>
+                <w:sz w:val="17"/>
+              </w:rPr>
+              <w:t>2027 (per park)</w:t>
+            </w:r>
+          </w:p>
+        </w:tc>
+        <w:tc>
+          <w:tcPr>
+            <w:tcW w:w="1871" w:type="dxa"/>
+          </w:tcPr>
+          <w:p>
+            <w:pPr>
+              <w:jc w:val="right"/>
+            </w:pPr>
+            <w:r>
+              <w:rPr>
+                <w:rFonts w:ascii="Calibri" w:hAnsi="Calibri"/>
+                <w:b w:val="0"/>
+                <w:i w:val="0"/>
+                <w:color w:val="000000"/>
+                <w:sz w:val="17"/>
+              </w:rPr>
+              <w:t>€12,405,139</w:t>
+            </w:r>
+          </w:p>
+        </w:tc>
+      </w:tr>
+      <w:tr>
+        <w:tc>
+          <w:tcPr>
+            <w:tcW w:w="3118" w:type="dxa"/>
+          </w:tcPr>
+          <w:p>
+            <w:pPr>
+              <w:jc w:val="left"/>
+            </w:pPr>
+            <w:r>
+              <w:rPr>
+                <w:rFonts w:ascii="Calibri" w:hAnsi="Calibri"/>
+                <w:b w:val="0"/>
+                <w:i w:val="0"/>
+                <w:color w:val="000000"/>
+                <w:sz w:val="17"/>
+              </w:rPr>
+              <w:t>Batch 3 — 2028</w:t>
             </w:r>
           </w:p>
         </w:tc>
@@ -2987,7 +3055,7 @@
                 <w:color w:val="000000"/>
                 <w:sz w:val="17"/>
               </w:rPr>
-              <w:t>30.0</w:t>
+              <w:t>125.0</w:t>
             </w:r>
           </w:p>
         </w:tc>
@@ -3007,7 +3075,7 @@
                 <w:color w:val="000000"/>
                 <w:sz w:val="17"/>
               </w:rPr>
-              <w:t>Signed / Q2 2026</w:t>
+              <w:t>Q2 2028</w:t>
             </w:r>
           </w:p>
         </w:tc>
@@ -3027,339 +3095,12 @@
                 <w:color w:val="000000"/>
                 <w:sz w:val="17"/>
               </w:rPr>
-              <w:t>€3,444,300</w:t>
-            </w:r>
-          </w:p>
-        </w:tc>
-      </w:tr>
-      <w:tr>
-        <w:tc>
-          <w:tcPr>
-            <w:tcW w:w="3118" w:type="dxa"/>
-          </w:tcPr>
-          <w:p>
-            <w:pPr>
-              <w:jc w:val="left"/>
-            </w:pPr>
-            <w:r>
-              <w:rPr>
-                <w:rFonts w:ascii="Calibri" w:hAnsi="Calibri"/>
-                <w:b w:val="0"/>
-                <w:i w:val="0"/>
-                <w:color w:val="000000"/>
-                <w:sz w:val="17"/>
-              </w:rPr>
-              <w:t>Phase 1 — 2026</w:t>
-            </w:r>
-          </w:p>
-        </w:tc>
-        <w:tc>
-          <w:tcPr>
-            <w:tcW w:w="567" w:type="dxa"/>
-          </w:tcPr>
-          <w:p>
-            <w:pPr>
-              <w:jc w:val="center"/>
-            </w:pPr>
-            <w:r>
-              <w:rPr>
-                <w:rFonts w:ascii="Calibri" w:hAnsi="Calibri"/>
-                <w:b w:val="0"/>
-                <w:i w:val="0"/>
-                <w:color w:val="000000"/>
-                <w:sz w:val="17"/>
-              </w:rPr>
-              <w:t>3</w:t>
-            </w:r>
-          </w:p>
-        </w:tc>
-        <w:tc>
-          <w:tcPr>
-            <w:tcW w:w="680" w:type="dxa"/>
-          </w:tcPr>
-          <w:p>
-            <w:pPr>
-              <w:jc w:val="right"/>
-            </w:pPr>
-            <w:r>
-              <w:rPr>
-                <w:rFonts w:ascii="Calibri" w:hAnsi="Calibri"/>
-                <w:b w:val="0"/>
-                <w:i w:val="0"/>
-                <w:color w:val="000000"/>
-                <w:sz w:val="17"/>
-              </w:rPr>
-              <w:t>180.0</w:t>
-            </w:r>
-          </w:p>
-        </w:tc>
-        <w:tc>
-          <w:tcPr>
-            <w:tcW w:w="1134" w:type="dxa"/>
-          </w:tcPr>
-          <w:p>
-            <w:pPr>
-              <w:jc w:val="right"/>
-            </w:pPr>
-            <w:r>
-              <w:rPr>
-                <w:rFonts w:ascii="Calibri" w:hAnsi="Calibri"/>
-                <w:b w:val="0"/>
-                <w:i w:val="0"/>
-                <w:color w:val="000000"/>
-                <w:sz w:val="17"/>
-              </w:rPr>
-              <w:t>Q2 2026</w:t>
-            </w:r>
-          </w:p>
-        </w:tc>
-        <w:tc>
-          <w:tcPr>
-            <w:tcW w:w="1871" w:type="dxa"/>
-          </w:tcPr>
-          <w:p>
-            <w:pPr>
-              <w:jc w:val="right"/>
-            </w:pPr>
-            <w:r>
-              <w:rPr>
-                <w:rFonts w:ascii="Calibri" w:hAnsi="Calibri"/>
-                <w:b w:val="0"/>
-                <w:i w:val="0"/>
-                <w:color w:val="000000"/>
-                <w:sz w:val="17"/>
-              </w:rPr>
-              <w:t>€18,048,873</w:t>
-            </w:r>
-          </w:p>
-        </w:tc>
-      </w:tr>
-      <w:tr>
-        <w:tc>
-          <w:tcPr>
-            <w:tcW w:w="3118" w:type="dxa"/>
-          </w:tcPr>
-          <w:p>
-            <w:pPr>
-              <w:jc w:val="left"/>
-            </w:pPr>
-            <w:r>
-              <w:rPr>
-                <w:rFonts w:ascii="Calibri" w:hAnsi="Calibri"/>
-                <w:b w:val="0"/>
-                <w:i w:val="0"/>
-                <w:color w:val="000000"/>
-                <w:sz w:val="17"/>
-              </w:rPr>
-              <w:t>Phase 2 — 2027</w:t>
-            </w:r>
-          </w:p>
-        </w:tc>
-        <w:tc>
-          <w:tcPr>
-            <w:tcW w:w="567" w:type="dxa"/>
-          </w:tcPr>
-          <w:p>
-            <w:pPr>
-              <w:jc w:val="center"/>
-            </w:pPr>
-            <w:r>
-              <w:rPr>
-                <w:rFonts w:ascii="Calibri" w:hAnsi="Calibri"/>
-                <w:b w:val="0"/>
-                <w:i w:val="0"/>
-                <w:color w:val="000000"/>
-                <w:sz w:val="17"/>
-              </w:rPr>
-              <w:t>1</w:t>
-            </w:r>
-          </w:p>
-        </w:tc>
-        <w:tc>
-          <w:tcPr>
-            <w:tcW w:w="680" w:type="dxa"/>
-          </w:tcPr>
-          <w:p>
-            <w:pPr>
-              <w:jc w:val="right"/>
-            </w:pPr>
-            <w:r>
-              <w:rPr>
-                <w:rFonts w:ascii="Calibri" w:hAnsi="Calibri"/>
-                <w:b w:val="0"/>
-                <w:i w:val="0"/>
-                <w:color w:val="000000"/>
-                <w:sz w:val="17"/>
-              </w:rPr>
-              <w:t>20.0</w:t>
-            </w:r>
-          </w:p>
-        </w:tc>
-        <w:tc>
-          <w:tcPr>
-            <w:tcW w:w="1134" w:type="dxa"/>
-          </w:tcPr>
-          <w:p>
-            <w:pPr>
-              <w:jc w:val="right"/>
-            </w:pPr>
-            <w:r>
-              <w:rPr>
-                <w:rFonts w:ascii="Calibri" w:hAnsi="Calibri"/>
-                <w:b w:val="0"/>
-                <w:i w:val="0"/>
-                <w:color w:val="000000"/>
-                <w:sz w:val="17"/>
-              </w:rPr>
-              <w:t>Q3 2027</w:t>
-            </w:r>
-          </w:p>
-        </w:tc>
-        <w:tc>
-          <w:tcPr>
-            <w:tcW w:w="1871" w:type="dxa"/>
-          </w:tcPr>
-          <w:p>
-            <w:pPr>
-              <w:jc w:val="right"/>
-            </w:pPr>
-            <w:r>
-              <w:rPr>
-                <w:rFonts w:ascii="Calibri" w:hAnsi="Calibri"/>
-                <w:b w:val="0"/>
-                <w:i w:val="0"/>
-                <w:color w:val="000000"/>
-                <w:sz w:val="17"/>
-              </w:rPr>
-              <w:t>€2,189,416</w:t>
-            </w:r>
-          </w:p>
-        </w:tc>
-      </w:tr>
-      <w:tr>
-        <w:tc>
-          <w:tcPr>
-            <w:tcW w:w="3118" w:type="dxa"/>
-          </w:tcPr>
-          <w:p>
-            <w:pPr>
-              <w:jc w:val="left"/>
-            </w:pPr>
-            <w:r>
-              <w:rPr>
-                <w:rFonts w:ascii="Calibri" w:hAnsi="Calibri"/>
-                <w:b w:val="0"/>
-                <w:i w:val="0"/>
-                <w:color w:val="000000"/>
-                <w:sz w:val="17"/>
-              </w:rPr>
-              <w:t>Phase 3 — Tseri 2028</w:t>
-            </w:r>
-          </w:p>
-        </w:tc>
-        <w:tc>
-          <w:tcPr>
-            <w:tcW w:w="567" w:type="dxa"/>
-          </w:tcPr>
-          <w:p>
-            <w:pPr>
-              <w:jc w:val="center"/>
-            </w:pPr>
-            <w:r>
-              <w:rPr>
-                <w:rFonts w:ascii="Calibri" w:hAnsi="Calibri"/>
-                <w:b w:val="0"/>
-                <w:i w:val="0"/>
-                <w:color w:val="000000"/>
-                <w:sz w:val="17"/>
-              </w:rPr>
-              <w:t>5</w:t>
-            </w:r>
-          </w:p>
-        </w:tc>
-        <w:tc>
-          <w:tcPr>
-            <w:tcW w:w="680" w:type="dxa"/>
-          </w:tcPr>
-          <w:p>
-            <w:pPr>
-              <w:jc w:val="right"/>
-            </w:pPr>
-            <w:r>
-              <w:rPr>
-                <w:rFonts w:ascii="Calibri" w:hAnsi="Calibri"/>
-                <w:b w:val="0"/>
-                <w:i w:val="0"/>
-                <w:color w:val="000000"/>
-                <w:sz w:val="17"/>
-              </w:rPr>
-              <w:t>87.5</w:t>
-            </w:r>
-          </w:p>
-        </w:tc>
-        <w:tc>
-          <w:tcPr>
-            <w:tcW w:w="1134" w:type="dxa"/>
-          </w:tcPr>
-          <w:p>
-            <w:pPr>
-              <w:jc w:val="right"/>
-            </w:pPr>
-            <w:r>
-              <w:rPr>
-                <w:rFonts w:ascii="Calibri" w:hAnsi="Calibri"/>
-                <w:b w:val="0"/>
-                <w:i w:val="0"/>
-                <w:color w:val="000000"/>
-                <w:sz w:val="17"/>
-              </w:rPr>
-              <w:t>2027</w:t>
-            </w:r>
-          </w:p>
-        </w:tc>
-        <w:tc>
-          <w:tcPr>
-            <w:tcW w:w="1871" w:type="dxa"/>
-          </w:tcPr>
-          <w:p>
-            <w:pPr>
-              <w:jc w:val="right"/>
-            </w:pPr>
-            <w:r>
-              <w:rPr>
-                <w:rFonts w:ascii="Calibri" w:hAnsi="Calibri"/>
-                <w:b w:val="0"/>
-                <w:i w:val="0"/>
-                <w:color w:val="000000"/>
-                <w:sz w:val="17"/>
-              </w:rPr>
-              <w:t>€9,805,639</w:t>
+              <w:t>€13,161,239</w:t>
             </w:r>
           </w:p>
         </w:tc>
       </w:tr>
     </w:tbl>
-    <w:p>
-      <w:pPr>
-        <w:spacing w:after="120"/>
-      </w:pPr>
-    </w:p>
-    <w:p>
-      <w:pPr>
-        <w:spacing w:after="100"/>
-        <w:jc w:val="both"/>
-      </w:pPr>
-      <w:r>
-        <w:rPr>
-          <w:rFonts w:ascii="Calibri" w:hAnsi="Calibri"/>
-          <w:b w:val="0"/>
-          <w:i w:val="0"/>
-          <w:color w:val="000000"/>
-          <w:sz w:val="20"/>
-        </w:rPr>
-        <w:t>Galascope target PAC: 31 January 2027. Galascope EPC is with Galascope Ltd; companion LTSA, EMS addendum, and OEM warranty undertaking per park are intended with that EPC.</w:t>
-      </w:r>
-    </w:p>
     <w:p>
       <w:pPr>
         <w:spacing w:before="320" w:after="80"/>
@@ -3388,7 +3129,7 @@
           <w:color w:val="000000"/>
           <w:sz w:val="20"/>
         </w:rPr>
-        <w:t>4.1  Indicative payment structure for each EPC (detail in the EPC): 30% advance; 55% pre-shipment; 10% on PAC; 5% retention released after a three (3) month defects liability period following PAC.</w:t>
+        <w:t>4.1  Schedule 1 shows Indicative Prices (excl. VAT) from Linyang quotation LY202601271. Payment terms, civil works scope, and the binding Contract Price are fixed in each executed EPC using the Indicative and Confirmed Price mechanism (EPC §6.1).</w:t>
       </w:r>
     </w:p>
     <w:p>
@@ -3404,7 +3145,7 @@
           <w:color w:val="000000"/>
           <w:sz w:val="20"/>
         </w:rPr>
-        <w:t>4.2  Prices exclude VAT. Client scope includes civil works, planning, permits, and grid connection fees unless agreed otherwise in the EPC.</w:t>
+        <w:t>Effective MWh for each pipeline park will be stated in that park's phase EPC Schedule A.</w:t>
       </w:r>
     </w:p>
     <w:p>
@@ -3420,22 +3161,7 @@
           <w:color w:val="000000"/>
           <w:sz w:val="20"/>
         </w:rPr>
-        <w:t>4.3  Schedule 1 pricing is indicative for ninety (90) days from this LOI. Material changes will be notified at least thirty (30) days before a phase EPC is signed.</w:t>
-      </w:r>
-    </w:p>
-    <w:p>
-      <w:pPr>
-        <w:spacing w:before="320" w:after="80"/>
-      </w:pPr>
-      <w:r>
-        <w:rPr>
-          <w:rFonts w:ascii="Calibri" w:hAnsi="Calibri"/>
-          <w:b/>
-          <w:i w:val="0"/>
-          <w:color w:val="C9A432"/>
-          <w:sz w:val="24"/>
-        </w:rPr>
-        <w:t>5.   COMPANION AGREEMENTS (INTENT)</w:t>
+        <w:t>4.2  Schedule 1 indicatives are valid for ninety (90) days from this LOI for planning. The Confirmed Contract Price for each park or batch is set in the EPC within fourteen (14) days after the Client receives grid Connection Terms for that park or batch.</w:t>
       </w:r>
     </w:p>
     <w:p>
@@ -3451,7 +3177,22 @@
           <w:color w:val="000000"/>
           <w:sz w:val="20"/>
         </w:rPr>
-        <w:t>5.1  LTSA and EMS: The Client intends to enter LTSA(s) and, where applicable, DISPERON EMS subscription (Lighthief EU BESS Ltd) with each commissioned park. Indicative EMS rate EUR 400/MWh/year from PAC (separate addendum). Terms per the executed LTSA and EMS documents.</w:t>
+        <w:t>4.3  (Two-way adjustment) The Confirmed Price equals the Indicative Price unless the battery raw-material index (Mysteel lithium carbonate) or EUR/CNY moves beyond the thresholds in EPC §6.1 from the January 2026 reference values. Where a threshold is exceeded, the Confirmed Price adjusts upward or downward to reflect verified movement on the equipment cost base; any downward adjustment is passed through to the Client on milestones not yet invoiced. Any upward adjustment is capped at five percent (5%) of the Indicative Price; if the calculated upward adjustment would exceed five percent (5%), either Party may terminate that EPC without penalty. Lighthief will issue a Price Basis Certificate at EPC signing and at equipment delivery showing the reference indices and calculation.</w:t>
+      </w:r>
+    </w:p>
+    <w:p>
+      <w:pPr>
+        <w:spacing w:before="320" w:after="80"/>
+      </w:pPr>
+      <w:r>
+        <w:rPr>
+          <w:rFonts w:ascii="Calibri" w:hAnsi="Calibri"/>
+          <w:b/>
+          <w:i w:val="0"/>
+          <w:color w:val="C9A432"/>
+          <w:sz w:val="24"/>
+        </w:rPr>
+        <w:t>5.   NEXT STEPS</w:t>
       </w:r>
     </w:p>
     <w:p>
@@ -3467,7 +3208,7 @@
           <w:color w:val="000000"/>
           <w:sz w:val="20"/>
         </w:rPr>
-        <w:t>5.2  Galascope: Companion documents for the Galascope batch (LTSA, EMS addendum, OEM warranty undertaking) are intended to be signed with the Galascope EPC.</w:t>
+        <w:t>5.1  The Parties will negotiate EPCs per batch in Section 3. LTSA, EMS, and warranty terms are agreed in each EPC — not in this LOI.</w:t>
       </w:r>
     </w:p>
     <w:p>
@@ -3482,7 +3223,7 @@
           <w:color w:val="C9A432"/>
           <w:sz w:val="24"/>
         </w:rPr>
-        <w:t>6.   GOOD FAITH AND PHASE EXIT</w:t>
+        <w:t>6.   GOOD FAITH</w:t>
       </w:r>
     </w:p>
     <w:p>
@@ -3498,7 +3239,7 @@
           <w:color w:val="000000"/>
           <w:sz w:val="20"/>
         </w:rPr>
-        <w:t>6.1  The Parties will negotiate each phase EPC in good faith. If terms are not agreed within sixty (60) days after the relevant EPC target date in Section 3, either Party may end this LOI for that phase only, without liability except Clause 1.3 costs.</w:t>
+        <w:t>6.1  The Parties will negotiate each batch EPC in good faith. If terms for a batch are not agreed within ninety (90) days of that batch's EPC target in Section 3, either Party may end this LOI for that batch only, without liability except Clause 1.3.</w:t>
       </w:r>
     </w:p>
     <w:p>
@@ -3529,7 +3270,7 @@
           <w:color w:val="000000"/>
           <w:sz w:val="20"/>
         </w:rPr>
-        <w:t>7.1  (Binding) Until this LOI expires or all Schedule 1 EPCs are signed, and for six (6) months after each park’s PAC, the Client will not appoint another EPC contractor for any Schedule 1 park without Lighthief’s consent.</w:t>
+        <w:t>7.1  (Binding) Until this LOI expires or the relevant Schedule 1 EPC is signed, the Client will not appoint another EPC contractor for those parks or procure parallel BESS equipment for them from an OEM other than Linyang (Cyprus portfolio).</w:t>
       </w:r>
     </w:p>
     <w:p>
@@ -3545,7 +3286,39 @@
           <w:color w:val="000000"/>
           <w:sz w:val="20"/>
         </w:rPr>
-        <w:t>7.2  This does not apply if Lighthief fails to agree an EPC for a phase within sixty (60) days after the target date, or if Lighthief materially breaches this LOI and does not remedy within thirty (30) days.</w:t>
+        <w:t>7.2  Exclusivity does not apply on Valid Reason (Clause 1.3) or if Lighthief has not proposed an EPC for signature within ninety (90) days of this LOI (unless extended in writing).</w:t>
+      </w:r>
+    </w:p>
+    <w:p>
+      <w:pPr>
+        <w:spacing w:after="100"/>
+        <w:jc w:val="both"/>
+      </w:pPr>
+      <w:r>
+        <w:rPr>
+          <w:rFonts w:ascii="Calibri" w:hAnsi="Calibri"/>
+          <w:b w:val="0"/>
+          <w:i w:val="0"/>
+          <w:color w:val="000000"/>
+          <w:sz w:val="20"/>
+        </w:rPr>
+        <w:t>7.3  Exclusivity ends when the Schedule 1 EPC is signed, on Valid Reason, or if either Party materially breaches this LOI and does not remedy within thirty (30) days of notice.</w:t>
+      </w:r>
+    </w:p>
+    <w:p>
+      <w:pPr>
+        <w:spacing w:after="100"/>
+        <w:jc w:val="both"/>
+      </w:pPr>
+      <w:r>
+        <w:rPr>
+          <w:rFonts w:ascii="Calibri" w:hAnsi="Calibri"/>
+          <w:b w:val="0"/>
+          <w:i w:val="0"/>
+          <w:color w:val="000000"/>
+          <w:sz w:val="20"/>
+        </w:rPr>
+        <w:t>7.4  Applies to the nine (9) pipeline parks only — not Galascope Ltd (LCY-LOI-GAL-B1-2026-R13).</w:t>
       </w:r>
     </w:p>
     <w:p>
@@ -3576,7 +3349,7 @@
           <w:color w:val="000000"/>
           <w:sz w:val="20"/>
         </w:rPr>
-        <w:t>8.1  (Binding) Each Party shall keep confidential this LOI and related commercial, technical, and pricing information, except to advisers, lenders, or as required by law. This survives for five (5) years after this LOI ends.</w:t>
+        <w:t>8.1  (Binding) Each Party shall keep confidential this LOI and related information, except to advisers, lenders, or as required by law. Survives five (5) years.</w:t>
       </w:r>
     </w:p>
     <w:p>
@@ -3623,49 +3396,11 @@
           <w:color w:val="000000"/>
           <w:sz w:val="20"/>
         </w:rPr>
-        <w:t>9.2  This LOI is governed by Cyprus law. Cyprus courts have exclusive jurisdiction.</w:t>
+        <w:t>9.2  Governed by Cyprus law. Cyprus courts have exclusive jurisdiction.</w:t>
       </w:r>
-    </w:p>
-    <w:p>
-      <w:pPr>
-        <w:spacing w:after="100"/>
-        <w:jc w:val="both"/>
-      </w:pPr>
-      <w:r>
-        <w:rPr>
-          <w:rFonts w:ascii="Calibri" w:hAnsi="Calibri"/>
-          <w:b w:val="0"/>
-          <w:i w:val="0"/>
-          <w:color w:val="000000"/>
-          <w:sz w:val="20"/>
-        </w:rPr>
-        <w:t>9.3  Amendments require written agreement. This LOI and Schedule 1 are the full record for the portfolio commitment described here.</w:t>
-      </w:r>
-    </w:p>
-    <w:p>
-      <w:pPr>
-        <w:spacing w:after="100"/>
-        <w:jc w:val="both"/>
-      </w:pPr>
-      <w:r>
-        <w:rPr>
-          <w:rFonts w:ascii="Calibri" w:hAnsi="Calibri"/>
-          <w:b w:val="0"/>
-          <w:i w:val="0"/>
-          <w:color w:val="000000"/>
-          <w:sz w:val="20"/>
-        </w:rPr>
-        <w:t>Notices: Lighthief — office@lighthief.com (Alexander Papacosta). Client — Dino Constantinou (details to be inserted).</w:t>
-      </w:r>
-    </w:p>
-    <w:p>
-      <w:pPr>
-        <w:spacing w:after="80"/>
-      </w:pPr>
     </w:p>
     <w:tbl>
       <w:tblPr>
-        <w:jc w:val="left"/>
         <w:tblLook w:firstColumn="1" w:firstRow="1" w:lastColumn="0" w:lastRow="0" w:noHBand="0" w:noVBand="1" w:val="04A0"/>
         <w:tblW w:w="7938" w:type="dxa"/>
         <w:tblLayout w:type="fixed"/>
@@ -3677,12 +3412,10 @@
         <w:tc>
           <w:tcPr>
             <w:shd w:val="clear" w:color="auto" w:fill="FEF3C7"/>
-            <w:vAlign w:val="center"/>
             <w:tcW w:w="7938" w:type="dxa"/>
           </w:tcPr>
           <w:p>
             <w:pPr>
-              <w:spacing w:before="120" w:after="120"/>
               <w:jc w:val="both"/>
             </w:pPr>
             <w:r>
@@ -3703,7 +3436,7 @@
                 <w:color w:val="78350F"/>
                 <w:sz w:val="18"/>
               </w:rPr>
-              <w:t>Non-binding except Clauses 1.3 (reliance costs), 7 (exclusivity), and 8 (confidentiality). This LOI covers Galascope 1 &amp; 2 and nine (9) pipeline parks in Schedule 1. Each EPC is binding only when signed. Legal and commercial detail (warranty, LDs, APG, price confirmation, etc.) is in the relevant EPC v5.1, not here.</w:t>
+              <w:t>Non-binding except Clauses 1.3, 7, and 8. Nine (9) pipeline parks only. Galascope Ltd: LCY-LOI-GAL-B1-2026-R13. Binding price and payment terms are in each EPC.</w:t>
             </w:r>
           </w:p>
         </w:tc>
@@ -3758,9 +3491,6 @@
             <w:tcW w:w="3969" w:type="dxa"/>
           </w:tcPr>
           <w:p>
-            <w:pPr>
-              <w:spacing w:before="100" w:after="100"/>
-            </w:pPr>
             <w:r>
               <w:rPr>
                 <w:rFonts w:ascii="Calibri" w:hAnsi="Calibri"/>
@@ -3781,9 +3511,6 @@
             <w:tcW w:w="3969" w:type="dxa"/>
           </w:tcPr>
           <w:p>
-            <w:pPr>
-              <w:spacing w:before="100" w:after="100"/>
-            </w:pPr>
             <w:r>
               <w:rPr>
                 <w:rFonts w:ascii="Calibri" w:hAnsi="Calibri"/>
@@ -3805,9 +3532,6 @@
             <w:tcW w:w="3969" w:type="dxa"/>
           </w:tcPr>
           <w:p>
-            <w:pPr>
-              <w:spacing w:before="140" w:after="140"/>
-            </w:pPr>
             <w:r>
               <w:rPr>
                 <w:rFonts w:ascii="Calibri" w:hAnsi="Calibri"/>
@@ -3825,9 +3549,6 @@
             <w:tcW w:w="3969" w:type="dxa"/>
           </w:tcPr>
           <w:p>
-            <w:pPr>
-              <w:spacing w:before="140" w:after="140"/>
-            </w:pPr>
             <w:r>
               <w:rPr>
                 <w:rFonts w:ascii="Calibri" w:hAnsi="Calibri"/>
@@ -3847,9 +3568,6 @@
             <w:tcW w:w="3969" w:type="dxa"/>
           </w:tcPr>
           <w:p>
-            <w:pPr>
-              <w:spacing w:before="140" w:after="140"/>
-            </w:pPr>
             <w:r>
               <w:rPr>
                 <w:rFonts w:ascii="Calibri" w:hAnsi="Calibri"/>
@@ -3867,9 +3585,6 @@
             <w:tcW w:w="3969" w:type="dxa"/>
           </w:tcPr>
           <w:p>
-            <w:pPr>
-              <w:spacing w:before="140" w:after="140"/>
-            </w:pPr>
             <w:r>
               <w:rPr>
                 <w:rFonts w:ascii="Calibri" w:hAnsi="Calibri"/>
@@ -3889,9 +3604,6 @@
             <w:tcW w:w="3969" w:type="dxa"/>
           </w:tcPr>
           <w:p>
-            <w:pPr>
-              <w:spacing w:before="140" w:after="140"/>
-            </w:pPr>
             <w:r>
               <w:rPr>
                 <w:rFonts w:ascii="Calibri" w:hAnsi="Calibri"/>
@@ -3909,9 +3621,6 @@
             <w:tcW w:w="3969" w:type="dxa"/>
           </w:tcPr>
           <w:p>
-            <w:pPr>
-              <w:spacing w:before="140" w:after="140"/>
-            </w:pPr>
             <w:r>
               <w:rPr>
                 <w:rFonts w:ascii="Calibri" w:hAnsi="Calibri"/>
@@ -3931,9 +3640,6 @@
             <w:tcW w:w="3969" w:type="dxa"/>
           </w:tcPr>
           <w:p>
-            <w:pPr>
-              <w:spacing w:before="140" w:after="140"/>
-            </w:pPr>
             <w:r>
               <w:rPr>
                 <w:rFonts w:ascii="Calibri" w:hAnsi="Calibri"/>
@@ -3951,9 +3657,6 @@
             <w:tcW w:w="3969" w:type="dxa"/>
           </w:tcPr>
           <w:p>
-            <w:pPr>
-              <w:spacing w:before="140" w:after="140"/>
-            </w:pPr>
             <w:r>
               <w:rPr>
                 <w:rFonts w:ascii="Calibri" w:hAnsi="Calibri"/>
@@ -3985,9 +3688,9 @@
           <w:color w:val="404040"/>
           <w:sz w:val="15"/>
         </w:rPr>
-        <w:t>Lighthief Cyprus Ltd  │  HE 477423  │  28 October Ave 249, Lophitis Business Center 1, Office 201, 3035 Limassol, Cyprus</w:t>
+        <w:t>Lighthief Cyprus Ltd  |  HE 477423  |  28 October Ave 249, Lophitis Business Center 1, Office 201, 3035 Limassol, Cyprus</w:t>
         <w:br/>
-        <w:t>office@lighthief.com  │  +357 77 77 00 50  │  solarfarms.cy  │  Ref: LCY-LOI-ESP-PIPELINE-2026-R4</w:t>
+        <w:t>office@lighthief.com  |  +357 77 77 00 50  |  solarfarms.cy  |  Ref: LCY-LOI-ESP-PIPELINE-2026-R13</w:t>
       </w:r>
     </w:p>
     <w:sectPr>

</xml_diff>

<commit_message>
Add Cyprus plants admin, Esperia/Linyang docs, RTB intelligence, and trading bot.
Includes prospect/plant APIs, CERA enrichment scripts, commercial guides, guarantee drafts, and stochrsi paper-trading scaffold alongside ongoing LOI and portfolio updates.

Co-authored-by: Cursor <cursoragent@cursor.com>
</commit_message>
<xml_diff>
--- a/docs/clients/group-order/Group2_Esperia_Energy/LOI-Esperia-Energy-pipeline-may2026.docx
+++ b/docs/clients/group-order/Group2_Esperia_Energy/LOI-Esperia-Energy-pipeline-may2026.docx
@@ -76,7 +76,7 @@
                 <w:color w:val="FFFFFF"/>
                 <w:sz w:val="16"/>
               </w:rPr>
-              <w:t>Ref: LCY-LOI-ESP-PIPELINE-2026-R13</w:t>
+              <w:t>Ref: LCY-LOI-ESP-PIPELINE-2026-R15</w:t>
               <w:br/>
             </w:r>
             <w:r>
@@ -3161,7 +3161,7 @@
           <w:color w:val="000000"/>
           <w:sz w:val="20"/>
         </w:rPr>
-        <w:t>4.2  Schedule 1 indicatives are valid for ninety (90) days from this LOI for planning. The Confirmed Contract Price for each park or batch is set in the EPC within fourteen (14) days after the Client receives grid Connection Terms for that park or batch.</w:t>
+        <w:t>4.2  Schedule 1 indicatives are valid for ninety (90) days from this LOI for planning. The Confirmed Contract Price for each park or batch is set when Lighthief issues the Confirmed Price Certificate under Clause 4.3.</w:t>
       </w:r>
     </w:p>
     <w:p>
@@ -3177,7 +3177,23 @@
           <w:color w:val="000000"/>
           <w:sz w:val="20"/>
         </w:rPr>
-        <w:t>4.3  (Two-way adjustment) The Confirmed Price equals the Indicative Price unless the battery raw-material index (Mysteel lithium carbonate) or EUR/CNY moves beyond the thresholds in EPC §6.1 from the January 2026 reference values. Where a threshold is exceeded, the Confirmed Price adjusts upward or downward to reflect verified movement on the equipment cost base; any downward adjustment is passed through to the Client on milestones not yet invoiced. Any upward adjustment is capped at five percent (5%) of the Indicative Price; if the calculated upward adjustment would exceed five percent (5%), either Party may terminate that EPC without penalty. Lighthief will issue a Price Basis Certificate at EPC signing and at equipment delivery showing the reference indices and calculation.</w:t>
+        <w:t>4.3  (Two-way price commitment) Each EPC will state an Indicative Price (as in Schedule 1 or updated in writing before signing). Within fourteen (14) days after the Client receives grid Connection Terms for that park or batch, Lighthief will issue a Confirmed Price Certificate fixing the Contract Price. The Confirmed Price equals the Indicative Price unless the battery raw-material index (Mysteel lithium carbonate) or EUR/CNY moves beyond the thresholds in EPC §6.1 from the January 2026 reference values (155,000 CNY/tonne (Mysteel China battery-grade spot, January 2026 monthly average); 8.18 CNY per EUR (January 2026 average)). Where a threshold is exceeded, the Confirmed Price adjusts to reflect verified movement on the equipment cost base: downward adjustments are passed through to the Client on milestones not yet invoiced; upward adjustments are capped at five percent (5%) of the Indicative Price. If the calculated upward adjustment would exceed five percent (5%), either Party may decline to proceed with that EPC without penalty. Lighthief will provide a Price Basis Certificate at EPC signing (and at equipment delivery where applicable) showing the reference indices and calculation so the Client can verify how the price follows the market.</w:t>
+      </w:r>
+    </w:p>
+    <w:p>
+      <w:pPr>
+        <w:spacing w:after="100"/>
+        <w:jc w:val="both"/>
+      </w:pPr>
+      <w:r>
+        <w:rPr>
+          <w:rFonts w:ascii="Calibri" w:hAnsi="Calibri"/>
+          <w:b w:val="0"/>
+          <w:i w:val="0"/>
+          <w:color w:val="000000"/>
+          <w:sz w:val="20"/>
+        </w:rPr>
+        <w:t>4.4  (Price lock — signature by 29 May 2026) The Parties acknowledge that, as of the date of this LOI, the Mysteel lithium carbonate index has moved materially above the January 2026 reference in Clause 4.3, while EUR/CNY remains within the EPC FX threshold. Schedule 1 therefore reflects pricing locked with Linyang on the January 2026 quotation basis, not today's spot index. Linyang has confirmed that where this LOI and the relevant park or batch EPC are executed on or before 29 May 2026, the Indicative Price (as in Schedule 1 or updated in writing before signing) shall be the Confirmed Price for equipment cost purposes, without upward raw-material or FX adjustment for index movement occurring before that EPC Effective Date. Clause 4.3 two-way adjustments apply after signing only to verified movement from the indices stated in the Price Basis Certificate at EPC signing.</w:t>
       </w:r>
     </w:p>
     <w:p>
@@ -3318,7 +3334,7 @@
           <w:color w:val="000000"/>
           <w:sz w:val="20"/>
         </w:rPr>
-        <w:t>7.4  Applies to the nine (9) pipeline parks only — not Galascope Ltd (LCY-LOI-GAL-B1-2026-R13).</w:t>
+        <w:t>7.4  Applies to the nine (9) pipeline parks only — not Galascope Ltd (LCY-LOI-GAL-B1-2026-R15).</w:t>
       </w:r>
     </w:p>
     <w:p>
@@ -3436,7 +3452,7 @@
                 <w:color w:val="78350F"/>
                 <w:sz w:val="18"/>
               </w:rPr>
-              <w:t>Non-binding except Clauses 1.3, 7, and 8. Nine (9) pipeline parks only. Galascope Ltd: LCY-LOI-GAL-B1-2026-R13. Binding price and payment terms are in each EPC.</w:t>
+              <w:t>Non-binding except Clauses 1.3, 7, and 8. Nine (9) pipeline parks only. Galascope Ltd: LCY-LOI-GAL-B1-2026-R15. Binding price and payment terms are in each EPC.</w:t>
             </w:r>
           </w:p>
         </w:tc>
@@ -3690,7 +3706,7 @@
         </w:rPr>
         <w:t>Lighthief Cyprus Ltd  |  HE 477423  |  28 October Ave 249, Lophitis Business Center 1, Office 201, 3035 Limassol, Cyprus</w:t>
         <w:br/>
-        <w:t>office@lighthief.com  |  +357 77 77 00 50  |  solarfarms.cy  |  Ref: LCY-LOI-ESP-PIPELINE-2026-R13</w:t>
+        <w:t>office@lighthief.com  |  +357 77 77 00 50  |  solarfarms.cy  |  Ref: LCY-LOI-ESP-PIPELINE-2026-R15</w:t>
       </w:r>
     </w:p>
     <w:sectPr>

</xml_diff>